<commit_message>
manual de usuario avance 1
</commit_message>
<xml_diff>
--- a/Manual de usuario JJRCh.docx
+++ b/Manual de usuario JJRCh.docx
@@ -108,87 +108,257 @@
       </w:r>
     </w:p>
     <w:p>
+      <w:r>
+        <w:t xml:space="preserve">Ingrese a su navegador de preferencia y </w:t>
+      </w:r>
+      <w:r>
+        <w:t xml:space="preserve">escriba </w:t>
+      </w:r>
+      <w:r>
+        <w:t>en la barra de búsquedas “</w:t>
+      </w:r>
+      <w:r>
+        <w:t>github.com</w:t>
+      </w:r>
+      <w:r>
+        <w:t>”</w:t>
+      </w:r>
+      <w:r>
+        <w:t xml:space="preserve"> y luego presiona </w:t>
+      </w:r>
+      <w:proofErr w:type="spellStart"/>
+      <w:r>
+        <w:t>enter</w:t>
+      </w:r>
+      <w:proofErr w:type="spellEnd"/>
+      <w:r>
+        <w:t>.</w:t>
+      </w:r>
+      <w:r>
+        <w:t xml:space="preserve"> Verá una </w:t>
+      </w:r>
+      <w:r>
+        <w:t>pantalla de bienvenida como la de la imagen.</w:t>
+      </w:r>
+    </w:p>
+    <w:p>
+      <w:pPr>
+        <w:jc w:val="center"/>
+      </w:pPr>
+      <w:r>
+        <w:drawing>
+          <wp:inline distT="0" distB="0" distL="0" distR="0" wp14:anchorId="25BCBAB6" wp14:editId="55CD6A4C">
+            <wp:extent cx="5612130" cy="2586990"/>
+            <wp:effectExtent l="0" t="0" r="7620" b="3810"/>
+            <wp:docPr id="1472703189" name="Imagen 1"/>
+            <wp:cNvGraphicFramePr>
+              <a:graphicFrameLocks xmlns:a="http://schemas.openxmlformats.org/drawingml/2006/main" noChangeAspect="1"/>
+            </wp:cNvGraphicFramePr>
+            <a:graphic xmlns:a="http://schemas.openxmlformats.org/drawingml/2006/main">
+              <a:graphicData uri="http://schemas.openxmlformats.org/drawingml/2006/picture">
+                <pic:pic xmlns:pic="http://schemas.openxmlformats.org/drawingml/2006/picture">
+                  <pic:nvPicPr>
+                    <pic:cNvPr id="1472703189" name=""/>
+                    <pic:cNvPicPr/>
+                  </pic:nvPicPr>
+                  <pic:blipFill>
+                    <a:blip r:embed="rId4"/>
+                    <a:stretch>
+                      <a:fillRect/>
+                    </a:stretch>
+                  </pic:blipFill>
+                  <pic:spPr>
+                    <a:xfrm>
+                      <a:off x="0" y="0"/>
+                      <a:ext cx="5612130" cy="2586990"/>
+                    </a:xfrm>
+                    <a:prstGeom prst="rect">
+                      <a:avLst/>
+                    </a:prstGeom>
+                  </pic:spPr>
+                </pic:pic>
+              </a:graphicData>
+            </a:graphic>
+          </wp:inline>
+        </w:drawing>
+      </w:r>
+    </w:p>
+    <w:p/>
+    <w:p/>
+    <w:p/>
+    <w:p/>
+    <w:p/>
+    <w:p>
+      <w:pPr>
+        <w:rPr>
+          <w:b/>
+          <w:bCs/>
+          <w:sz w:val="32"/>
+          <w:szCs w:val="32"/>
+        </w:rPr>
+      </w:pPr>
+      <w:r>
+        <w:rPr>
+          <w:b/>
+          <w:bCs/>
+          <w:sz w:val="32"/>
+          <w:szCs w:val="32"/>
+        </w:rPr>
+        <w:lastRenderedPageBreak/>
+        <w:t xml:space="preserve">Paso </w:t>
+      </w:r>
+      <w:r>
+        <w:rPr>
+          <w:b/>
+          <w:bCs/>
+          <w:sz w:val="32"/>
+          <w:szCs w:val="32"/>
+        </w:rPr>
+        <w:t>2</w:t>
+      </w:r>
+      <w:r>
+        <w:rPr>
+          <w:b/>
+          <w:bCs/>
+          <w:sz w:val="32"/>
+          <w:szCs w:val="32"/>
+        </w:rPr>
+        <w:t>:</w:t>
+      </w:r>
+    </w:p>
+    <w:p>
+      <w:pPr>
+        <w:rPr>
+          <w:noProof/>
+        </w:rPr>
+      </w:pPr>
+      <w:r>
+        <w:t>En la barra de búsqueda que se encuentra arriba a la derecha</w:t>
+      </w:r>
+      <w:r>
+        <w:t xml:space="preserve"> escriba “</w:t>
+      </w:r>
+      <w:proofErr w:type="spellStart"/>
+      <w:r>
+        <w:t>ProyectoPOO_JJRCh</w:t>
+      </w:r>
+      <w:proofErr w:type="spellEnd"/>
+      <w:r>
+        <w:t xml:space="preserve">” y presiona </w:t>
+      </w:r>
+      <w:proofErr w:type="spellStart"/>
+      <w:r>
+        <w:t>enter</w:t>
+      </w:r>
+      <w:proofErr w:type="spellEnd"/>
+      <w:r>
+        <w:t>.</w:t>
+      </w:r>
+      <w:r>
+        <w:rPr>
+          <w:noProof/>
+        </w:rPr>
+        <w:t xml:space="preserve"> </w:t>
+      </w:r>
+      <w:r>
+        <w:rPr>
+          <w:noProof/>
+        </w:rPr>
+        <w:t>Aperecerá un repositorio del mismo nombre, haga clic sobre el nombre del repositorio.</w:t>
+      </w:r>
+    </w:p>
+    <w:p>
+      <w:pPr>
+        <w:rPr>
+          <w:noProof/>
+        </w:rPr>
+      </w:pPr>
+      <w:r>
+        <w:rPr>
+          <w:noProof/>
+        </w:rPr>
+        <w:drawing>
+          <wp:inline distT="0" distB="0" distL="0" distR="0" wp14:anchorId="4D52860A" wp14:editId="06313C15">
+            <wp:extent cx="5612130" cy="2597150"/>
+            <wp:effectExtent l="0" t="0" r="7620" b="0"/>
+            <wp:docPr id="455101064" name="Imagen 1"/>
+            <wp:cNvGraphicFramePr>
+              <a:graphicFrameLocks xmlns:a="http://schemas.openxmlformats.org/drawingml/2006/main" noChangeAspect="1"/>
+            </wp:cNvGraphicFramePr>
+            <a:graphic xmlns:a="http://schemas.openxmlformats.org/drawingml/2006/main">
+              <a:graphicData uri="http://schemas.openxmlformats.org/drawingml/2006/picture">
+                <pic:pic xmlns:pic="http://schemas.openxmlformats.org/drawingml/2006/picture">
+                  <pic:nvPicPr>
+                    <pic:cNvPr id="455101064" name=""/>
+                    <pic:cNvPicPr/>
+                  </pic:nvPicPr>
+                  <pic:blipFill>
+                    <a:blip r:embed="rId5"/>
+                    <a:stretch>
+                      <a:fillRect/>
+                    </a:stretch>
+                  </pic:blipFill>
+                  <pic:spPr>
+                    <a:xfrm>
+                      <a:off x="0" y="0"/>
+                      <a:ext cx="5612130" cy="2597150"/>
+                    </a:xfrm>
+                    <a:prstGeom prst="rect">
+                      <a:avLst/>
+                    </a:prstGeom>
+                  </pic:spPr>
+                </pic:pic>
+              </a:graphicData>
+            </a:graphic>
+          </wp:inline>
+        </w:drawing>
+      </w:r>
+    </w:p>
+    <w:p>
+      <w:pPr>
+        <w:rPr>
+          <w:b/>
+          <w:bCs/>
+          <w:sz w:val="32"/>
+          <w:szCs w:val="32"/>
+        </w:rPr>
+      </w:pPr>
+      <w:r>
+        <w:rPr>
+          <w:b/>
+          <w:bCs/>
+          <w:sz w:val="32"/>
+          <w:szCs w:val="32"/>
+        </w:rPr>
+        <w:t xml:space="preserve">Paso </w:t>
+      </w:r>
+      <w:r>
+        <w:rPr>
+          <w:b/>
+          <w:bCs/>
+          <w:sz w:val="32"/>
+          <w:szCs w:val="32"/>
+        </w:rPr>
+        <w:t>3</w:t>
+      </w:r>
+      <w:r>
+        <w:rPr>
+          <w:b/>
+          <w:bCs/>
+          <w:sz w:val="32"/>
+          <w:szCs w:val="32"/>
+        </w:rPr>
+        <w:t>:</w:t>
+      </w:r>
+    </w:p>
+    <w:p>
       <w:pPr>
         <w:rPr>
           <w:u w:val="single"/>
         </w:rPr>
       </w:pPr>
       <w:r>
-        <w:t>Ingrese a su navegador de preferencia y busque en la barra de búsquedas la palabra “GitHub”</w:t>
-      </w:r>
-    </w:p>
-    <w:p>
-      <w:pPr>
-        <w:rPr>
-          <w:b/>
-          <w:bCs/>
-          <w:sz w:val="32"/>
-          <w:szCs w:val="32"/>
-        </w:rPr>
-      </w:pPr>
-      <w:r>
-        <w:rPr>
-          <w:b/>
-          <w:bCs/>
-          <w:sz w:val="32"/>
-          <w:szCs w:val="32"/>
-        </w:rPr>
-        <w:t xml:space="preserve">Paso </w:t>
-      </w:r>
-      <w:r>
-        <w:rPr>
-          <w:b/>
-          <w:bCs/>
-          <w:sz w:val="32"/>
-          <w:szCs w:val="32"/>
-        </w:rPr>
-        <w:t>2</w:t>
-      </w:r>
-      <w:r>
-        <w:rPr>
-          <w:b/>
-          <w:bCs/>
-          <w:sz w:val="32"/>
-          <w:szCs w:val="32"/>
-        </w:rPr>
-        <w:t>:</w:t>
-      </w:r>
-    </w:p>
-    <w:p>
-      <w:pPr>
-        <w:rPr>
-          <w:b/>
-          <w:bCs/>
-          <w:sz w:val="32"/>
-          <w:szCs w:val="32"/>
-        </w:rPr>
-      </w:pPr>
-      <w:r>
-        <w:rPr>
-          <w:b/>
-          <w:bCs/>
-          <w:sz w:val="32"/>
-          <w:szCs w:val="32"/>
-        </w:rPr>
-        <w:t xml:space="preserve">Paso </w:t>
-      </w:r>
-      <w:r>
-        <w:rPr>
-          <w:b/>
-          <w:bCs/>
-          <w:sz w:val="32"/>
-          <w:szCs w:val="32"/>
-        </w:rPr>
-        <w:t>3</w:t>
-      </w:r>
-      <w:r>
-        <w:rPr>
-          <w:b/>
-          <w:bCs/>
-          <w:sz w:val="32"/>
-          <w:szCs w:val="32"/>
-        </w:rPr>
-        <w:t>:</w:t>
+        <w:t xml:space="preserve">Al darle clic al repositorio </w:t>
       </w:r>
     </w:p>
     <w:p>
@@ -1185,7 +1355,6 @@
   <w:style w:type="character" w:default="1" w:styleId="Fuentedeprrafopredeter">
     <w:name w:val="Default Paragraph Font"/>
     <w:uiPriority w:val="1"/>
-    <w:semiHidden/>
     <w:unhideWhenUsed/>
   </w:style>
   <w:style w:type="table" w:default="1" w:styleId="Tablanormal">
@@ -1497,6 +1666,29 @@
       <w:smallCaps/>
       <w:color w:val="2F5496" w:themeColor="accent1" w:themeShade="BF"/>
       <w:spacing w:val="5"/>
+    </w:rPr>
+  </w:style>
+  <w:style w:type="character" w:styleId="Hipervnculo">
+    <w:name w:val="Hyperlink"/>
+    <w:basedOn w:val="Fuentedeprrafopredeter"/>
+    <w:uiPriority w:val="99"/>
+    <w:unhideWhenUsed/>
+    <w:rsid w:val="000E6C50"/>
+    <w:rPr>
+      <w:color w:val="0563C1" w:themeColor="hyperlink"/>
+      <w:u w:val="single"/>
+    </w:rPr>
+  </w:style>
+  <w:style w:type="character" w:styleId="Mencinsinresolver">
+    <w:name w:val="Unresolved Mention"/>
+    <w:basedOn w:val="Fuentedeprrafopredeter"/>
+    <w:uiPriority w:val="99"/>
+    <w:semiHidden/>
+    <w:unhideWhenUsed/>
+    <w:rsid w:val="000E6C50"/>
+    <w:rPr>
+      <w:color w:val="605E5C"/>
+      <w:shd w:val="clear" w:color="auto" w:fill="E1DFDD"/>
     </w:rPr>
   </w:style>
 </w:styles>

</xml_diff>

<commit_message>
Manual de usuario completo
</commit_message>
<xml_diff>
--- a/Manual de usuario JJRCh.docx
+++ b/Manual de usuario JJRCh.docx
@@ -124,13 +124,8 @@
         <w:t>”</w:t>
       </w:r>
       <w:r>
-        <w:t xml:space="preserve"> y luego presiona </w:t>
-      </w:r>
-      <w:proofErr w:type="spellStart"/>
-      <w:r>
-        <w:t>enter</w:t>
-      </w:r>
-      <w:proofErr w:type="spellEnd"/>
+        <w:t xml:space="preserve"> y luego presiona enter</w:t>
+      </w:r>
       <w:r>
         <w:t>.</w:t>
       </w:r>
@@ -238,21 +233,11 @@
       <w:r>
         <w:t xml:space="preserve"> escriba “</w:t>
       </w:r>
-      <w:proofErr w:type="spellStart"/>
       <w:r>
         <w:t>ProyectoPOO_JJRCh</w:t>
       </w:r>
-      <w:proofErr w:type="spellEnd"/>
-      <w:r>
-        <w:t xml:space="preserve">” y presiona </w:t>
-      </w:r>
-      <w:proofErr w:type="spellStart"/>
-      <w:r>
-        <w:t>enter</w:t>
-      </w:r>
-      <w:proofErr w:type="spellEnd"/>
-      <w:r>
-        <w:t>.</w:t>
+      <w:r>
+        <w:t>” y presiona enter.</w:t>
       </w:r>
       <w:r>
         <w:rPr>
@@ -352,31 +337,89 @@
       </w:r>
     </w:p>
     <w:p>
-      <w:pPr>
-        <w:rPr>
-          <w:u w:val="single"/>
-        </w:rPr>
-      </w:pPr>
       <w:r>
         <w:t xml:space="preserve">Al darle clic al repositorio </w:t>
       </w:r>
-    </w:p>
-    <w:p>
-      <w:pPr>
-        <w:rPr>
-          <w:b/>
-          <w:bCs/>
-          <w:sz w:val="32"/>
-          <w:szCs w:val="32"/>
-        </w:rPr>
-      </w:pPr>
-      <w:r>
-        <w:rPr>
-          <w:b/>
-          <w:bCs/>
-          <w:sz w:val="32"/>
-          <w:szCs w:val="32"/>
-        </w:rPr>
+      <w:r>
+        <w:t>podrá ver su información detallada</w:t>
+      </w:r>
+      <w:r>
+        <w:t xml:space="preserve">, </w:t>
+      </w:r>
+      <w:r>
+        <w:t>en el cuadro que aparece al entrar debe buscar un archivo con extensión .zip</w:t>
+      </w:r>
+      <w:r>
+        <w:t xml:space="preserve"> y darle clic sobre el nombre del archivo</w:t>
+      </w:r>
+      <w:r>
+        <w:t>.</w:t>
+      </w:r>
+    </w:p>
+    <w:p>
+      <w:pPr>
+        <w:jc w:val="center"/>
+      </w:pPr>
+      <w:r>
+        <w:drawing>
+          <wp:inline distT="0" distB="0" distL="0" distR="0" wp14:anchorId="4D03A53C" wp14:editId="1FE6CAF6">
+            <wp:extent cx="2377646" cy="2941575"/>
+            <wp:effectExtent l="0" t="0" r="3810" b="0"/>
+            <wp:docPr id="1660294790" name="Imagen 1"/>
+            <wp:cNvGraphicFramePr>
+              <a:graphicFrameLocks xmlns:a="http://schemas.openxmlformats.org/drawingml/2006/main" noChangeAspect="1"/>
+            </wp:cNvGraphicFramePr>
+            <a:graphic xmlns:a="http://schemas.openxmlformats.org/drawingml/2006/main">
+              <a:graphicData uri="http://schemas.openxmlformats.org/drawingml/2006/picture">
+                <pic:pic xmlns:pic="http://schemas.openxmlformats.org/drawingml/2006/picture">
+                  <pic:nvPicPr>
+                    <pic:cNvPr id="1660294790" name=""/>
+                    <pic:cNvPicPr/>
+                  </pic:nvPicPr>
+                  <pic:blipFill>
+                    <a:blip r:embed="rId6"/>
+                    <a:stretch>
+                      <a:fillRect/>
+                    </a:stretch>
+                  </pic:blipFill>
+                  <pic:spPr>
+                    <a:xfrm>
+                      <a:off x="0" y="0"/>
+                      <a:ext cx="2377646" cy="2941575"/>
+                    </a:xfrm>
+                    <a:prstGeom prst="rect">
+                      <a:avLst/>
+                    </a:prstGeom>
+                  </pic:spPr>
+                </pic:pic>
+              </a:graphicData>
+            </a:graphic>
+          </wp:inline>
+        </w:drawing>
+      </w:r>
+    </w:p>
+    <w:p>
+      <w:pPr>
+        <w:jc w:val="center"/>
+      </w:pPr>
+    </w:p>
+    <w:p>
+      <w:pPr>
+        <w:rPr>
+          <w:b/>
+          <w:bCs/>
+          <w:sz w:val="32"/>
+          <w:szCs w:val="32"/>
+        </w:rPr>
+      </w:pPr>
+      <w:r>
+        <w:rPr>
+          <w:b/>
+          <w:bCs/>
+          <w:sz w:val="32"/>
+          <w:szCs w:val="32"/>
+        </w:rPr>
+        <w:lastRenderedPageBreak/>
         <w:t xml:space="preserve">Paso </w:t>
       </w:r>
       <w:r>
@@ -399,6 +442,83 @@
       </w:r>
     </w:p>
     <w:p>
+      <w:r>
+        <w:t xml:space="preserve">Después de </w:t>
+      </w:r>
+      <w:r>
+        <w:t xml:space="preserve">esto </w:t>
+      </w:r>
+      <w:r>
+        <w:t xml:space="preserve">verá un </w:t>
+      </w:r>
+      <w:r>
+        <w:t xml:space="preserve">cuadro que no muestra información, </w:t>
+      </w:r>
+      <w:r>
+        <w:t>en la parte de la izquierda</w:t>
+      </w:r>
+      <w:r>
+        <w:t xml:space="preserve"> de este cuadro </w:t>
+      </w:r>
+      <w:r>
+        <w:t xml:space="preserve">encontrará un botón con el </w:t>
+      </w:r>
+      <w:r>
+        <w:t>símbolo de descarga</w:t>
+      </w:r>
+      <w:r>
+        <w:t>, presiónelo para empezar la descarga del programa.</w:t>
+      </w:r>
+      <w:r>
+        <w:t xml:space="preserve"> Si se abre el explorador de archivos elija donde quiere descargar el archivo y </w:t>
+      </w:r>
+      <w:r>
+        <w:t>luego toque el botón de guardar.</w:t>
+      </w:r>
+    </w:p>
+    <w:p>
+      <w:pPr>
+        <w:jc w:val="center"/>
+      </w:pPr>
+      <w:r>
+        <w:drawing>
+          <wp:inline distT="0" distB="0" distL="0" distR="0" wp14:anchorId="0B6E5F66" wp14:editId="0CE56651">
+            <wp:extent cx="5612130" cy="1153160"/>
+            <wp:effectExtent l="0" t="0" r="7620" b="8890"/>
+            <wp:docPr id="2095608941" name="Imagen 1"/>
+            <wp:cNvGraphicFramePr>
+              <a:graphicFrameLocks xmlns:a="http://schemas.openxmlformats.org/drawingml/2006/main" noChangeAspect="1"/>
+            </wp:cNvGraphicFramePr>
+            <a:graphic xmlns:a="http://schemas.openxmlformats.org/drawingml/2006/main">
+              <a:graphicData uri="http://schemas.openxmlformats.org/drawingml/2006/picture">
+                <pic:pic xmlns:pic="http://schemas.openxmlformats.org/drawingml/2006/picture">
+                  <pic:nvPicPr>
+                    <pic:cNvPr id="2095608941" name=""/>
+                    <pic:cNvPicPr/>
+                  </pic:nvPicPr>
+                  <pic:blipFill>
+                    <a:blip r:embed="rId7"/>
+                    <a:stretch>
+                      <a:fillRect/>
+                    </a:stretch>
+                  </pic:blipFill>
+                  <pic:spPr>
+                    <a:xfrm>
+                      <a:off x="0" y="0"/>
+                      <a:ext cx="5612130" cy="1153160"/>
+                    </a:xfrm>
+                    <a:prstGeom prst="rect">
+                      <a:avLst/>
+                    </a:prstGeom>
+                  </pic:spPr>
+                </pic:pic>
+              </a:graphicData>
+            </a:graphic>
+          </wp:inline>
+        </w:drawing>
+      </w:r>
+    </w:p>
+    <w:p>
       <w:pPr>
         <w:rPr>
           <w:b/>
@@ -436,21 +556,300 @@
       </w:r>
     </w:p>
     <w:p>
-      <w:pPr>
-        <w:rPr>
-          <w:b/>
-          <w:bCs/>
-          <w:sz w:val="32"/>
-          <w:szCs w:val="32"/>
-        </w:rPr>
-      </w:pPr>
-      <w:r>
-        <w:rPr>
-          <w:b/>
-          <w:bCs/>
-          <w:sz w:val="32"/>
-          <w:szCs w:val="32"/>
-        </w:rPr>
+      <w:r>
+        <w:t xml:space="preserve">Cuando la descarga finaliza </w:t>
+      </w:r>
+      <w:r>
+        <w:t>abra la carpeta donde descargó el archivo, selecciónelo</w:t>
+      </w:r>
+      <w:r>
+        <w:t xml:space="preserve">, presione clic derecho y extraiga </w:t>
+      </w:r>
+      <w:r>
+        <w:t xml:space="preserve">los archivos. Si cuenta con </w:t>
+      </w:r>
+      <w:r>
+        <w:t xml:space="preserve">un descompresor de archivos como WinRAR o 7zip puede utilizarlos, sino Windows cuenta con su </w:t>
+      </w:r>
+      <w:r>
+        <w:t>propio programa.</w:t>
+      </w:r>
+    </w:p>
+    <w:p>
+      <w:pPr>
+        <w:jc w:val="center"/>
+      </w:pPr>
+      <w:r>
+        <w:drawing>
+          <wp:inline distT="0" distB="0" distL="0" distR="0" wp14:anchorId="3B701191" wp14:editId="555EAABC">
+            <wp:extent cx="4778154" cy="670618"/>
+            <wp:effectExtent l="0" t="0" r="3810" b="0"/>
+            <wp:docPr id="362935002" name="Imagen 1"/>
+            <wp:cNvGraphicFramePr>
+              <a:graphicFrameLocks xmlns:a="http://schemas.openxmlformats.org/drawingml/2006/main" noChangeAspect="1"/>
+            </wp:cNvGraphicFramePr>
+            <a:graphic xmlns:a="http://schemas.openxmlformats.org/drawingml/2006/main">
+              <a:graphicData uri="http://schemas.openxmlformats.org/drawingml/2006/picture">
+                <pic:pic xmlns:pic="http://schemas.openxmlformats.org/drawingml/2006/picture">
+                  <pic:nvPicPr>
+                    <pic:cNvPr id="362935002" name=""/>
+                    <pic:cNvPicPr/>
+                  </pic:nvPicPr>
+                  <pic:blipFill>
+                    <a:blip r:embed="rId8"/>
+                    <a:stretch>
+                      <a:fillRect/>
+                    </a:stretch>
+                  </pic:blipFill>
+                  <pic:spPr>
+                    <a:xfrm>
+                      <a:off x="0" y="0"/>
+                      <a:ext cx="4778154" cy="670618"/>
+                    </a:xfrm>
+                    <a:prstGeom prst="rect">
+                      <a:avLst/>
+                    </a:prstGeom>
+                  </pic:spPr>
+                </pic:pic>
+              </a:graphicData>
+            </a:graphic>
+          </wp:inline>
+        </w:drawing>
+      </w:r>
+    </w:p>
+    <w:p>
+      <w:pPr>
+        <w:jc w:val="center"/>
+      </w:pPr>
+      <w:r>
+        <w:drawing>
+          <wp:inline distT="0" distB="0" distL="0" distR="0" wp14:anchorId="50203AA3" wp14:editId="7F766749">
+            <wp:extent cx="2537680" cy="1005927"/>
+            <wp:effectExtent l="0" t="0" r="0" b="3810"/>
+            <wp:docPr id="477688545" name="Imagen 1"/>
+            <wp:cNvGraphicFramePr>
+              <a:graphicFrameLocks xmlns:a="http://schemas.openxmlformats.org/drawingml/2006/main" noChangeAspect="1"/>
+            </wp:cNvGraphicFramePr>
+            <a:graphic xmlns:a="http://schemas.openxmlformats.org/drawingml/2006/main">
+              <a:graphicData uri="http://schemas.openxmlformats.org/drawingml/2006/picture">
+                <pic:pic xmlns:pic="http://schemas.openxmlformats.org/drawingml/2006/picture">
+                  <pic:nvPicPr>
+                    <pic:cNvPr id="477688545" name=""/>
+                    <pic:cNvPicPr/>
+                  </pic:nvPicPr>
+                  <pic:blipFill>
+                    <a:blip r:embed="rId9"/>
+                    <a:stretch>
+                      <a:fillRect/>
+                    </a:stretch>
+                  </pic:blipFill>
+                  <pic:spPr>
+                    <a:xfrm>
+                      <a:off x="0" y="0"/>
+                      <a:ext cx="2537680" cy="1005927"/>
+                    </a:xfrm>
+                    <a:prstGeom prst="rect">
+                      <a:avLst/>
+                    </a:prstGeom>
+                  </pic:spPr>
+                </pic:pic>
+              </a:graphicData>
+            </a:graphic>
+          </wp:inline>
+        </w:drawing>
+      </w:r>
+    </w:p>
+    <w:p>
+      <w:pPr>
+        <w:jc w:val="center"/>
+        <w:rPr>
+          <w:sz w:val="22"/>
+          <w:szCs w:val="22"/>
+        </w:rPr>
+      </w:pPr>
+      <w:r>
+        <w:rPr>
+          <w:sz w:val="22"/>
+          <w:szCs w:val="22"/>
+        </w:rPr>
+        <w:t>(Ejemplo de WinRAR, presiona extraer aquí)</w:t>
+      </w:r>
+    </w:p>
+    <w:p>
+      <w:pPr>
+        <w:jc w:val="center"/>
+        <w:rPr>
+          <w:sz w:val="22"/>
+          <w:szCs w:val="22"/>
+        </w:rPr>
+      </w:pPr>
+      <w:r>
+        <w:rPr>
+          <w:sz w:val="22"/>
+          <w:szCs w:val="22"/>
+        </w:rPr>
+        <w:drawing>
+          <wp:inline distT="0" distB="0" distL="0" distR="0" wp14:anchorId="34DA2584" wp14:editId="2FDDFE6A">
+            <wp:extent cx="3254022" cy="502964"/>
+            <wp:effectExtent l="0" t="0" r="3810" b="0"/>
+            <wp:docPr id="213333991" name="Imagen 1"/>
+            <wp:cNvGraphicFramePr>
+              <a:graphicFrameLocks xmlns:a="http://schemas.openxmlformats.org/drawingml/2006/main" noChangeAspect="1"/>
+            </wp:cNvGraphicFramePr>
+            <a:graphic xmlns:a="http://schemas.openxmlformats.org/drawingml/2006/main">
+              <a:graphicData uri="http://schemas.openxmlformats.org/drawingml/2006/picture">
+                <pic:pic xmlns:pic="http://schemas.openxmlformats.org/drawingml/2006/picture">
+                  <pic:nvPicPr>
+                    <pic:cNvPr id="213333991" name=""/>
+                    <pic:cNvPicPr/>
+                  </pic:nvPicPr>
+                  <pic:blipFill>
+                    <a:blip r:embed="rId10"/>
+                    <a:stretch>
+                      <a:fillRect/>
+                    </a:stretch>
+                  </pic:blipFill>
+                  <pic:spPr>
+                    <a:xfrm>
+                      <a:off x="0" y="0"/>
+                      <a:ext cx="3254022" cy="502964"/>
+                    </a:xfrm>
+                    <a:prstGeom prst="rect">
+                      <a:avLst/>
+                    </a:prstGeom>
+                  </pic:spPr>
+                </pic:pic>
+              </a:graphicData>
+            </a:graphic>
+          </wp:inline>
+        </w:drawing>
+      </w:r>
+    </w:p>
+    <w:p>
+      <w:pPr>
+        <w:jc w:val="center"/>
+        <w:rPr>
+          <w:sz w:val="22"/>
+          <w:szCs w:val="22"/>
+        </w:rPr>
+      </w:pPr>
+      <w:r>
+        <w:rPr>
+          <w:sz w:val="22"/>
+          <w:szCs w:val="22"/>
+        </w:rPr>
+        <w:t>(Ejemplo de Windows, presiona extraer todo</w:t>
+      </w:r>
+      <w:r>
+        <w:rPr>
+          <w:sz w:val="22"/>
+          <w:szCs w:val="22"/>
+        </w:rPr>
+        <w:t xml:space="preserve">, </w:t>
+      </w:r>
+      <w:r>
+        <w:rPr>
+          <w:sz w:val="22"/>
+          <w:szCs w:val="22"/>
+        </w:rPr>
+        <w:t>elige donde extraerlo</w:t>
+      </w:r>
+      <w:r>
+        <w:rPr>
+          <w:sz w:val="22"/>
+          <w:szCs w:val="22"/>
+        </w:rPr>
+        <w:t xml:space="preserve"> y </w:t>
+      </w:r>
+      <w:r>
+        <w:rPr>
+          <w:sz w:val="22"/>
+          <w:szCs w:val="22"/>
+        </w:rPr>
+        <w:t>toca</w:t>
+      </w:r>
+      <w:r>
+        <w:rPr>
+          <w:sz w:val="22"/>
+          <w:szCs w:val="22"/>
+        </w:rPr>
+        <w:t xml:space="preserve"> ext</w:t>
+      </w:r>
+      <w:r>
+        <w:rPr>
+          <w:sz w:val="22"/>
+          <w:szCs w:val="22"/>
+        </w:rPr>
+        <w:t>r</w:t>
+      </w:r>
+      <w:r>
+        <w:rPr>
+          <w:sz w:val="22"/>
+          <w:szCs w:val="22"/>
+        </w:rPr>
+        <w:t>aer</w:t>
+      </w:r>
+      <w:r>
+        <w:rPr>
+          <w:sz w:val="22"/>
+          <w:szCs w:val="22"/>
+        </w:rPr>
+        <w:t>)</w:t>
+      </w:r>
+    </w:p>
+    <w:p>
+      <w:pPr>
+        <w:jc w:val="center"/>
+        <w:rPr>
+          <w:sz w:val="22"/>
+          <w:szCs w:val="22"/>
+        </w:rPr>
+      </w:pPr>
+    </w:p>
+    <w:p>
+      <w:pPr>
+        <w:jc w:val="center"/>
+        <w:rPr>
+          <w:sz w:val="22"/>
+          <w:szCs w:val="22"/>
+        </w:rPr>
+      </w:pPr>
+    </w:p>
+    <w:p>
+      <w:pPr>
+        <w:jc w:val="center"/>
+        <w:rPr>
+          <w:sz w:val="22"/>
+          <w:szCs w:val="22"/>
+        </w:rPr>
+      </w:pPr>
+    </w:p>
+    <w:p>
+      <w:pPr>
+        <w:jc w:val="center"/>
+        <w:rPr>
+          <w:sz w:val="22"/>
+          <w:szCs w:val="22"/>
+        </w:rPr>
+      </w:pPr>
+    </w:p>
+    <w:p>
+      <w:pPr>
+        <w:rPr>
+          <w:b/>
+          <w:bCs/>
+          <w:sz w:val="32"/>
+          <w:szCs w:val="32"/>
+        </w:rPr>
+      </w:pPr>
+      <w:r>
+        <w:rPr>
+          <w:b/>
+          <w:bCs/>
+          <w:sz w:val="32"/>
+          <w:szCs w:val="32"/>
+        </w:rPr>
+        <w:lastRenderedPageBreak/>
         <w:t xml:space="preserve">Paso </w:t>
       </w:r>
       <w:r>
@@ -473,31 +872,252 @@
       </w:r>
     </w:p>
     <w:p>
-      <w:pPr>
-        <w:rPr>
-          <w:b/>
-          <w:bCs/>
-          <w:sz w:val="32"/>
-          <w:szCs w:val="32"/>
-        </w:rPr>
-      </w:pPr>
-      <w:r>
-        <w:rPr>
-          <w:b/>
-          <w:bCs/>
-          <w:sz w:val="32"/>
-          <w:szCs w:val="32"/>
-        </w:rPr>
-        <w:t xml:space="preserve">Paso </w:t>
-      </w:r>
-      <w:r>
-        <w:rPr>
-          <w:b/>
-          <w:bCs/>
-          <w:sz w:val="32"/>
-          <w:szCs w:val="32"/>
-        </w:rPr>
-        <w:t>7</w:t>
+      <w:r>
+        <w:t xml:space="preserve">Luego de extraer los archivos </w:t>
+      </w:r>
+      <w:r>
+        <w:t xml:space="preserve">abra la carpeta que se genera y podrá ver </w:t>
+      </w:r>
+      <w:r>
+        <w:t xml:space="preserve">un archivo con extensión .exe y otras carpetas, con esto ya tiene el </w:t>
+      </w:r>
+      <w:r>
+        <w:t>programa descargado y listo para usar, solo debe darle doble clic al archivo .exe y el programa se abrirá.</w:t>
+      </w:r>
+      <w:r>
+        <w:t xml:space="preserve"> A </w:t>
+      </w:r>
+      <w:r>
+        <w:t>continuación,</w:t>
+      </w:r>
+      <w:r>
+        <w:t xml:space="preserve"> se explicará </w:t>
+      </w:r>
+      <w:r>
+        <w:t>cómo</w:t>
+      </w:r>
+      <w:r>
+        <w:t xml:space="preserve"> usar </w:t>
+      </w:r>
+      <w:r>
+        <w:t>cada parte del sistema en detalle.</w:t>
+      </w:r>
+    </w:p>
+    <w:p>
+      <w:pPr>
+        <w:jc w:val="center"/>
+      </w:pPr>
+      <w:r>
+        <w:drawing>
+          <wp:inline distT="0" distB="0" distL="0" distR="0" wp14:anchorId="288E48B0" wp14:editId="75875FFA">
+            <wp:extent cx="5494496" cy="1005927"/>
+            <wp:effectExtent l="0" t="0" r="0" b="3810"/>
+            <wp:docPr id="393754598" name="Imagen 1"/>
+            <wp:cNvGraphicFramePr>
+              <a:graphicFrameLocks xmlns:a="http://schemas.openxmlformats.org/drawingml/2006/main" noChangeAspect="1"/>
+            </wp:cNvGraphicFramePr>
+            <a:graphic xmlns:a="http://schemas.openxmlformats.org/drawingml/2006/main">
+              <a:graphicData uri="http://schemas.openxmlformats.org/drawingml/2006/picture">
+                <pic:pic xmlns:pic="http://schemas.openxmlformats.org/drawingml/2006/picture">
+                  <pic:nvPicPr>
+                    <pic:cNvPr id="393754598" name=""/>
+                    <pic:cNvPicPr/>
+                  </pic:nvPicPr>
+                  <pic:blipFill>
+                    <a:blip r:embed="rId11"/>
+                    <a:stretch>
+                      <a:fillRect/>
+                    </a:stretch>
+                  </pic:blipFill>
+                  <pic:spPr>
+                    <a:xfrm>
+                      <a:off x="0" y="0"/>
+                      <a:ext cx="5494496" cy="1005927"/>
+                    </a:xfrm>
+                    <a:prstGeom prst="rect">
+                      <a:avLst/>
+                    </a:prstGeom>
+                  </pic:spPr>
+                </pic:pic>
+              </a:graphicData>
+            </a:graphic>
+          </wp:inline>
+        </w:drawing>
+      </w:r>
+    </w:p>
+    <w:p>
+      <w:pPr>
+        <w:jc w:val="center"/>
+      </w:pPr>
+      <w:r>
+        <w:drawing>
+          <wp:inline distT="0" distB="0" distL="0" distR="0" wp14:anchorId="62D558EE" wp14:editId="2DC17E1A">
+            <wp:extent cx="4160881" cy="2682472"/>
+            <wp:effectExtent l="0" t="0" r="0" b="3810"/>
+            <wp:docPr id="2004437550" name="Imagen 1"/>
+            <wp:cNvGraphicFramePr>
+              <a:graphicFrameLocks xmlns:a="http://schemas.openxmlformats.org/drawingml/2006/main" noChangeAspect="1"/>
+            </wp:cNvGraphicFramePr>
+            <a:graphic xmlns:a="http://schemas.openxmlformats.org/drawingml/2006/main">
+              <a:graphicData uri="http://schemas.openxmlformats.org/drawingml/2006/picture">
+                <pic:pic xmlns:pic="http://schemas.openxmlformats.org/drawingml/2006/picture">
+                  <pic:nvPicPr>
+                    <pic:cNvPr id="2004437550" name=""/>
+                    <pic:cNvPicPr/>
+                  </pic:nvPicPr>
+                  <pic:blipFill>
+                    <a:blip r:embed="rId12"/>
+                    <a:stretch>
+                      <a:fillRect/>
+                    </a:stretch>
+                  </pic:blipFill>
+                  <pic:spPr>
+                    <a:xfrm>
+                      <a:off x="0" y="0"/>
+                      <a:ext cx="4160881" cy="2682472"/>
+                    </a:xfrm>
+                    <a:prstGeom prst="rect">
+                      <a:avLst/>
+                    </a:prstGeom>
+                  </pic:spPr>
+                </pic:pic>
+              </a:graphicData>
+            </a:graphic>
+          </wp:inline>
+        </w:drawing>
+      </w:r>
+    </w:p>
+    <w:p>
+      <w:r>
+        <w:br w:type="page"/>
+      </w:r>
+    </w:p>
+    <w:p>
+      <w:pPr>
+        <w:rPr>
+          <w:b/>
+          <w:bCs/>
+          <w:sz w:val="32"/>
+          <w:szCs w:val="32"/>
+        </w:rPr>
+      </w:pPr>
+      <w:r>
+        <w:rPr>
+          <w:b/>
+          <w:bCs/>
+          <w:sz w:val="32"/>
+          <w:szCs w:val="32"/>
+        </w:rPr>
+        <w:lastRenderedPageBreak/>
+        <w:t>Usar el programa:</w:t>
+      </w:r>
+    </w:p>
+    <w:p>
+      <w:r>
+        <w:t xml:space="preserve">Este es un programa para administrar préstamos, con esto podrá crear </w:t>
+      </w:r>
+      <w:r>
+        <w:t xml:space="preserve">y administrar </w:t>
+      </w:r>
+      <w:r>
+        <w:t xml:space="preserve">los </w:t>
+      </w:r>
+      <w:r>
+        <w:t>usuarios a</w:t>
+      </w:r>
+      <w:r>
+        <w:t xml:space="preserve"> </w:t>
+      </w:r>
+      <w:r>
+        <w:t xml:space="preserve">los cuales se les va a crear </w:t>
+      </w:r>
+      <w:r>
+        <w:t>el préstamo, los ítems que se van a prestar</w:t>
+      </w:r>
+      <w:r>
+        <w:t xml:space="preserve"> y las </w:t>
+      </w:r>
+      <w:r>
+        <w:t>categorías y tipo</w:t>
+      </w:r>
+      <w:r>
+        <w:t xml:space="preserve"> de cada ítem</w:t>
+      </w:r>
+      <w:r>
+        <w:t xml:space="preserve">. También </w:t>
+      </w:r>
+      <w:r>
+        <w:t xml:space="preserve">podrá establecer una alerta </w:t>
+      </w:r>
+      <w:r>
+        <w:t>al abrir el programa</w:t>
+      </w:r>
+      <w:r>
+        <w:t xml:space="preserve"> </w:t>
+      </w:r>
+      <w:r>
+        <w:t>para recordarle cuando el plazo de</w:t>
+      </w:r>
+      <w:r>
+        <w:t xml:space="preserve"> uno o varios</w:t>
+      </w:r>
+      <w:r>
+        <w:t xml:space="preserve"> préstamo</w:t>
+      </w:r>
+      <w:r>
+        <w:t>s</w:t>
+      </w:r>
+      <w:r>
+        <w:t xml:space="preserve"> </w:t>
+      </w:r>
+      <w:r>
+        <w:t>finaliz</w:t>
+      </w:r>
+      <w:r>
+        <w:t>ó</w:t>
+      </w:r>
+      <w:r>
+        <w:t xml:space="preserve">. </w:t>
+      </w:r>
+      <w:r>
+        <w:t>Por último,</w:t>
+      </w:r>
+      <w:r>
+        <w:t xml:space="preserve"> podrá ver los reportes filtrados por usuarios, ítems, categorías y tipos</w:t>
+      </w:r>
+      <w:r>
+        <w:t>, junto con información adicional de cada uno</w:t>
+      </w:r>
+      <w:r>
+        <w:t>.</w:t>
+      </w:r>
+      <w:r>
+        <w:t xml:space="preserve"> El programa cuenta con persistencia de </w:t>
+      </w:r>
+      <w:r>
+        <w:t xml:space="preserve">datos por lo que la información ingresada se mantendrá </w:t>
+      </w:r>
+      <w:r>
+        <w:t>aun cuando se cierra y se vuelve a abrir.</w:t>
+      </w:r>
+    </w:p>
+    <w:p>
+      <w:pPr>
+        <w:rPr>
+          <w:b/>
+          <w:bCs/>
+          <w:sz w:val="32"/>
+          <w:szCs w:val="32"/>
+        </w:rPr>
+      </w:pPr>
+      <w:r>
+        <w:rPr>
+          <w:b/>
+          <w:bCs/>
+          <w:sz w:val="32"/>
+          <w:szCs w:val="32"/>
+        </w:rPr>
+        <w:t>Pantalla principal</w:t>
       </w:r>
       <w:r>
         <w:rPr>
@@ -510,31 +1130,45 @@
       </w:r>
     </w:p>
     <w:p>
-      <w:pPr>
-        <w:rPr>
-          <w:b/>
-          <w:bCs/>
-          <w:sz w:val="32"/>
-          <w:szCs w:val="32"/>
-        </w:rPr>
-      </w:pPr>
-      <w:r>
-        <w:rPr>
-          <w:b/>
-          <w:bCs/>
-          <w:sz w:val="32"/>
-          <w:szCs w:val="32"/>
-        </w:rPr>
-        <w:t xml:space="preserve">Paso </w:t>
-      </w:r>
-      <w:r>
-        <w:rPr>
-          <w:b/>
-          <w:bCs/>
-          <w:sz w:val="32"/>
-          <w:szCs w:val="32"/>
-        </w:rPr>
-        <w:t>8</w:t>
+      <w:r>
+        <w:t>Esta es la pantalla que ve al iniciar el programa</w:t>
+      </w:r>
+      <w:r>
+        <w:t>, en la parte superior podrá ver tres pestañas, una para préstamos, un</w:t>
+      </w:r>
+      <w:r>
+        <w:t>a</w:t>
+      </w:r>
+      <w:r>
+        <w:t xml:space="preserve"> para administración de </w:t>
+      </w:r>
+      <w:r>
+        <w:t>los diferentes elementos de un préstamo y una para ver los diferentes reportes que se generan</w:t>
+      </w:r>
+      <w:r>
+        <w:t>.</w:t>
+      </w:r>
+      <w:r>
+        <w:t xml:space="preserve"> Con el fin de mostrar el funcionamiento de forma progresiva y realista se empezará explicando la pestaña de Administración.</w:t>
+      </w:r>
+    </w:p>
+    <w:p>
+      <w:pPr>
+        <w:rPr>
+          <w:b/>
+          <w:bCs/>
+          <w:sz w:val="32"/>
+          <w:szCs w:val="32"/>
+        </w:rPr>
+      </w:pPr>
+      <w:r>
+        <w:rPr>
+          <w:b/>
+          <w:bCs/>
+          <w:sz w:val="32"/>
+          <w:szCs w:val="32"/>
+        </w:rPr>
+        <w:t>Pestaña de administración</w:t>
       </w:r>
       <w:r>
         <w:rPr>
@@ -547,31 +1181,90 @@
       </w:r>
     </w:p>
     <w:p>
-      <w:pPr>
-        <w:rPr>
-          <w:b/>
-          <w:bCs/>
-          <w:sz w:val="32"/>
-          <w:szCs w:val="32"/>
-        </w:rPr>
-      </w:pPr>
-      <w:r>
-        <w:rPr>
-          <w:b/>
-          <w:bCs/>
-          <w:sz w:val="32"/>
-          <w:szCs w:val="32"/>
-        </w:rPr>
-        <w:t xml:space="preserve">Paso </w:t>
-      </w:r>
-      <w:r>
-        <w:rPr>
-          <w:b/>
-          <w:bCs/>
-          <w:sz w:val="32"/>
-          <w:szCs w:val="32"/>
-        </w:rPr>
-        <w:t>9</w:t>
+      <w:r>
+        <w:t>Aquí se encontrará con cuatro diferentes botones</w:t>
+      </w:r>
+      <w:r>
+        <w:t xml:space="preserve">, una aclaración es que el botón de ítems está bloqueado hasta que cree al menos un tipo y una categoría, esto porque </w:t>
+      </w:r>
+      <w:r>
+        <w:t xml:space="preserve">ambos son necesarios para crear un ítem. Con </w:t>
+      </w:r>
+      <w:r>
+        <w:t xml:space="preserve">el botón de Usuarios podrá crear, editar y borrar usuarios, </w:t>
+      </w:r>
+      <w:r>
+        <w:t>los demás botones hacen lo mismo con su respectiva sección que se muestra en el botón</w:t>
+      </w:r>
+      <w:r>
+        <w:t xml:space="preserve"> correspondiente.</w:t>
+      </w:r>
+    </w:p>
+    <w:p>
+      <w:pPr>
+        <w:jc w:val="center"/>
+      </w:pPr>
+      <w:r>
+        <w:drawing>
+          <wp:inline distT="0" distB="0" distL="0" distR="0" wp14:anchorId="1FFDAD00" wp14:editId="61E29983">
+            <wp:extent cx="4160881" cy="2682472"/>
+            <wp:effectExtent l="0" t="0" r="0" b="3810"/>
+            <wp:docPr id="669474520" name="Imagen 1"/>
+            <wp:cNvGraphicFramePr>
+              <a:graphicFrameLocks xmlns:a="http://schemas.openxmlformats.org/drawingml/2006/main" noChangeAspect="1"/>
+            </wp:cNvGraphicFramePr>
+            <a:graphic xmlns:a="http://schemas.openxmlformats.org/drawingml/2006/main">
+              <a:graphicData uri="http://schemas.openxmlformats.org/drawingml/2006/picture">
+                <pic:pic xmlns:pic="http://schemas.openxmlformats.org/drawingml/2006/picture">
+                  <pic:nvPicPr>
+                    <pic:cNvPr id="669474520" name=""/>
+                    <pic:cNvPicPr/>
+                  </pic:nvPicPr>
+                  <pic:blipFill>
+                    <a:blip r:embed="rId13"/>
+                    <a:stretch>
+                      <a:fillRect/>
+                    </a:stretch>
+                  </pic:blipFill>
+                  <pic:spPr>
+                    <a:xfrm>
+                      <a:off x="0" y="0"/>
+                      <a:ext cx="4160881" cy="2682472"/>
+                    </a:xfrm>
+                    <a:prstGeom prst="rect">
+                      <a:avLst/>
+                    </a:prstGeom>
+                  </pic:spPr>
+                </pic:pic>
+              </a:graphicData>
+            </a:graphic>
+          </wp:inline>
+        </w:drawing>
+      </w:r>
+    </w:p>
+    <w:p>
+      <w:pPr>
+        <w:jc w:val="center"/>
+      </w:pPr>
+    </w:p>
+    <w:p>
+      <w:pPr>
+        <w:rPr>
+          <w:b/>
+          <w:bCs/>
+          <w:sz w:val="32"/>
+          <w:szCs w:val="32"/>
+        </w:rPr>
+      </w:pPr>
+      <w:r>
+        <w:rPr>
+          <w:b/>
+          <w:bCs/>
+          <w:sz w:val="32"/>
+          <w:szCs w:val="32"/>
+        </w:rPr>
+        <w:lastRenderedPageBreak/>
+        <w:t>Usuarios</w:t>
       </w:r>
       <w:r>
         <w:rPr>
@@ -584,31 +1277,81 @@
       </w:r>
     </w:p>
     <w:p>
-      <w:pPr>
-        <w:rPr>
-          <w:b/>
-          <w:bCs/>
-          <w:sz w:val="32"/>
-          <w:szCs w:val="32"/>
-        </w:rPr>
-      </w:pPr>
-      <w:r>
-        <w:rPr>
-          <w:b/>
-          <w:bCs/>
-          <w:sz w:val="32"/>
-          <w:szCs w:val="32"/>
-        </w:rPr>
-        <w:t xml:space="preserve">Paso </w:t>
-      </w:r>
-      <w:r>
-        <w:rPr>
-          <w:b/>
-          <w:bCs/>
-          <w:sz w:val="32"/>
-          <w:szCs w:val="32"/>
-        </w:rPr>
-        <w:t>10</w:t>
+      <w:r>
+        <w:t xml:space="preserve">Al tocar el botón de usuarios verá una pantalla nueva con </w:t>
+      </w:r>
+      <w:r>
+        <w:t xml:space="preserve">una tabla </w:t>
+      </w:r>
+      <w:r>
+        <w:t>que contiene la información de todos los usuarios creados, si es su primera vez usando el programa est</w:t>
+      </w:r>
+      <w:r>
+        <w:t>a tabla estará vacía</w:t>
+      </w:r>
+      <w:r>
+        <w:t>. Los botones de editar y borrar no servirán si no hay usuarios ya que es necesario seleccionar uno para realizar la acción.</w:t>
+      </w:r>
+    </w:p>
+    <w:p>
+      <w:pPr>
+        <w:jc w:val="center"/>
+      </w:pPr>
+      <w:r>
+        <w:drawing>
+          <wp:inline distT="0" distB="0" distL="0" distR="0" wp14:anchorId="32B6CC40" wp14:editId="29C68333">
+            <wp:extent cx="4160881" cy="2796782"/>
+            <wp:effectExtent l="0" t="0" r="0" b="3810"/>
+            <wp:docPr id="1599460978" name="Imagen 1"/>
+            <wp:cNvGraphicFramePr>
+              <a:graphicFrameLocks xmlns:a="http://schemas.openxmlformats.org/drawingml/2006/main" noChangeAspect="1"/>
+            </wp:cNvGraphicFramePr>
+            <a:graphic xmlns:a="http://schemas.openxmlformats.org/drawingml/2006/main">
+              <a:graphicData uri="http://schemas.openxmlformats.org/drawingml/2006/picture">
+                <pic:pic xmlns:pic="http://schemas.openxmlformats.org/drawingml/2006/picture">
+                  <pic:nvPicPr>
+                    <pic:cNvPr id="1599460978" name=""/>
+                    <pic:cNvPicPr/>
+                  </pic:nvPicPr>
+                  <pic:blipFill>
+                    <a:blip r:embed="rId14"/>
+                    <a:stretch>
+                      <a:fillRect/>
+                    </a:stretch>
+                  </pic:blipFill>
+                  <pic:spPr>
+                    <a:xfrm>
+                      <a:off x="0" y="0"/>
+                      <a:ext cx="4160881" cy="2796782"/>
+                    </a:xfrm>
+                    <a:prstGeom prst="rect">
+                      <a:avLst/>
+                    </a:prstGeom>
+                  </pic:spPr>
+                </pic:pic>
+              </a:graphicData>
+            </a:graphic>
+          </wp:inline>
+        </w:drawing>
+      </w:r>
+    </w:p>
+    <w:p>
+      <w:pPr>
+        <w:rPr>
+          <w:b/>
+          <w:bCs/>
+          <w:sz w:val="32"/>
+          <w:szCs w:val="32"/>
+        </w:rPr>
+      </w:pPr>
+      <w:r>
+        <w:rPr>
+          <w:b/>
+          <w:bCs/>
+          <w:sz w:val="32"/>
+          <w:szCs w:val="32"/>
+        </w:rPr>
+        <w:t>Crear usuario</w:t>
       </w:r>
       <w:r>
         <w:rPr>
@@ -621,31 +1364,148 @@
       </w:r>
     </w:p>
     <w:p>
-      <w:pPr>
-        <w:rPr>
-          <w:b/>
-          <w:bCs/>
-          <w:sz w:val="32"/>
-          <w:szCs w:val="32"/>
-        </w:rPr>
-      </w:pPr>
-      <w:r>
-        <w:rPr>
-          <w:b/>
-          <w:bCs/>
-          <w:sz w:val="32"/>
-          <w:szCs w:val="32"/>
-        </w:rPr>
-        <w:t>Paso 1</w:t>
-      </w:r>
-      <w:r>
-        <w:rPr>
-          <w:b/>
-          <w:bCs/>
-          <w:sz w:val="32"/>
-          <w:szCs w:val="32"/>
-        </w:rPr>
-        <w:t>1</w:t>
+      <w:r>
+        <w:t xml:space="preserve">Cuando cree un usuario se abrirá otra ventana donde </w:t>
+      </w:r>
+      <w:r>
+        <w:t xml:space="preserve">le solicitará </w:t>
+      </w:r>
+      <w:r>
+        <w:t xml:space="preserve">cierta </w:t>
+      </w:r>
+      <w:r>
+        <w:t>información</w:t>
+      </w:r>
+      <w:r>
+        <w:t xml:space="preserve">, el usuario admite letras, números y símbolos, el correo </w:t>
+      </w:r>
+      <w:r>
+        <w:t>también,</w:t>
+      </w:r>
+      <w:r>
+        <w:t xml:space="preserve"> pero es obligatorio que lleve </w:t>
+      </w:r>
+      <w:r>
+        <w:t xml:space="preserve">un “@” y “.com” para ser admitido, el </w:t>
+      </w:r>
+      <w:r>
+        <w:t xml:space="preserve">teléfono solo admite números. Cuando llena toda la información de forma correcta </w:t>
+      </w:r>
+      <w:r>
+        <w:t xml:space="preserve">presione </w:t>
+      </w:r>
+      <w:r>
+        <w:t xml:space="preserve">el botón OK, </w:t>
+      </w:r>
+      <w:r>
+        <w:t>se cerrará la ventana y podrá ver el usuario creado en la ventana de usuarios</w:t>
+      </w:r>
+      <w:r>
+        <w:t>.</w:t>
+      </w:r>
+    </w:p>
+    <w:p>
+      <w:pPr>
+        <w:jc w:val="center"/>
+      </w:pPr>
+      <w:r>
+        <w:drawing>
+          <wp:inline distT="0" distB="0" distL="0" distR="0" wp14:anchorId="45C5876E" wp14:editId="45E95590">
+            <wp:extent cx="2781541" cy="2072820"/>
+            <wp:effectExtent l="0" t="0" r="0" b="3810"/>
+            <wp:docPr id="139364373" name="Imagen 1"/>
+            <wp:cNvGraphicFramePr>
+              <a:graphicFrameLocks xmlns:a="http://schemas.openxmlformats.org/drawingml/2006/main" noChangeAspect="1"/>
+            </wp:cNvGraphicFramePr>
+            <a:graphic xmlns:a="http://schemas.openxmlformats.org/drawingml/2006/main">
+              <a:graphicData uri="http://schemas.openxmlformats.org/drawingml/2006/picture">
+                <pic:pic xmlns:pic="http://schemas.openxmlformats.org/drawingml/2006/picture">
+                  <pic:nvPicPr>
+                    <pic:cNvPr id="139364373" name=""/>
+                    <pic:cNvPicPr/>
+                  </pic:nvPicPr>
+                  <pic:blipFill>
+                    <a:blip r:embed="rId15"/>
+                    <a:stretch>
+                      <a:fillRect/>
+                    </a:stretch>
+                  </pic:blipFill>
+                  <pic:spPr>
+                    <a:xfrm>
+                      <a:off x="0" y="0"/>
+                      <a:ext cx="2781541" cy="2072820"/>
+                    </a:xfrm>
+                    <a:prstGeom prst="rect">
+                      <a:avLst/>
+                    </a:prstGeom>
+                  </pic:spPr>
+                </pic:pic>
+              </a:graphicData>
+            </a:graphic>
+          </wp:inline>
+        </w:drawing>
+      </w:r>
+    </w:p>
+    <w:p>
+      <w:pPr>
+        <w:jc w:val="center"/>
+      </w:pPr>
+      <w:r>
+        <w:lastRenderedPageBreak/>
+        <w:drawing>
+          <wp:inline distT="0" distB="0" distL="0" distR="0" wp14:anchorId="6EE95188" wp14:editId="07E9B73C">
+            <wp:extent cx="4160881" cy="2796782"/>
+            <wp:effectExtent l="0" t="0" r="0" b="3810"/>
+            <wp:docPr id="1768739543" name="Imagen 1"/>
+            <wp:cNvGraphicFramePr>
+              <a:graphicFrameLocks xmlns:a="http://schemas.openxmlformats.org/drawingml/2006/main" noChangeAspect="1"/>
+            </wp:cNvGraphicFramePr>
+            <a:graphic xmlns:a="http://schemas.openxmlformats.org/drawingml/2006/main">
+              <a:graphicData uri="http://schemas.openxmlformats.org/drawingml/2006/picture">
+                <pic:pic xmlns:pic="http://schemas.openxmlformats.org/drawingml/2006/picture">
+                  <pic:nvPicPr>
+                    <pic:cNvPr id="1768739543" name=""/>
+                    <pic:cNvPicPr/>
+                  </pic:nvPicPr>
+                  <pic:blipFill>
+                    <a:blip r:embed="rId16"/>
+                    <a:stretch>
+                      <a:fillRect/>
+                    </a:stretch>
+                  </pic:blipFill>
+                  <pic:spPr>
+                    <a:xfrm>
+                      <a:off x="0" y="0"/>
+                      <a:ext cx="4160881" cy="2796782"/>
+                    </a:xfrm>
+                    <a:prstGeom prst="rect">
+                      <a:avLst/>
+                    </a:prstGeom>
+                  </pic:spPr>
+                </pic:pic>
+              </a:graphicData>
+            </a:graphic>
+          </wp:inline>
+        </w:drawing>
+      </w:r>
+    </w:p>
+    <w:p>
+      <w:pPr>
+        <w:rPr>
+          <w:b/>
+          <w:bCs/>
+          <w:sz w:val="32"/>
+          <w:szCs w:val="32"/>
+        </w:rPr>
+      </w:pPr>
+      <w:r>
+        <w:rPr>
+          <w:b/>
+          <w:bCs/>
+          <w:sz w:val="32"/>
+          <w:szCs w:val="32"/>
+        </w:rPr>
+        <w:t>Editar usuario</w:t>
       </w:r>
       <w:r>
         <w:rPr>
@@ -658,31 +1518,232 @@
       </w:r>
     </w:p>
     <w:p>
-      <w:pPr>
-        <w:rPr>
-          <w:b/>
-          <w:bCs/>
-          <w:sz w:val="32"/>
-          <w:szCs w:val="32"/>
-        </w:rPr>
-      </w:pPr>
-      <w:r>
-        <w:rPr>
-          <w:b/>
-          <w:bCs/>
-          <w:sz w:val="32"/>
-          <w:szCs w:val="32"/>
-        </w:rPr>
-        <w:t>Paso 1</w:t>
-      </w:r>
-      <w:r>
-        <w:rPr>
-          <w:b/>
-          <w:bCs/>
-          <w:sz w:val="32"/>
-          <w:szCs w:val="32"/>
-        </w:rPr>
-        <w:t>2</w:t>
+      <w:r>
+        <w:t xml:space="preserve">Cuando hay al menos un usuario creado puede </w:t>
+      </w:r>
+      <w:r>
+        <w:t>seleccionar</w:t>
+      </w:r>
+      <w:r>
+        <w:t xml:space="preserve">lo </w:t>
+      </w:r>
+      <w:r>
+        <w:t xml:space="preserve">presionar el botón de editar </w:t>
+      </w:r>
+      <w:r>
+        <w:t xml:space="preserve">y se abrirá la misma ventana </w:t>
+      </w:r>
+      <w:r>
+        <w:t xml:space="preserve">para crear un </w:t>
+      </w:r>
+      <w:r>
+        <w:t>usuario,</w:t>
+      </w:r>
+      <w:r>
+        <w:t xml:space="preserve"> pero con la información que anteriormente ingresó, aquí podrá </w:t>
+      </w:r>
+      <w:r>
+        <w:t>modificar lo que necesite y al presionar OK se actualizará la tabla con la información nueva</w:t>
+      </w:r>
+      <w:r>
+        <w:t xml:space="preserve"> </w:t>
+      </w:r>
+      <w:r>
+        <w:t xml:space="preserve">(si hay varios </w:t>
+      </w:r>
+      <w:r>
+        <w:t xml:space="preserve">usuarios </w:t>
+      </w:r>
+      <w:r>
+        <w:t>selecciona el que quiere editar y toca el botón de editar)</w:t>
+      </w:r>
+      <w:r>
+        <w:t>.</w:t>
+      </w:r>
+      <w:r>
+        <w:t xml:space="preserve"> Si presiona el botón de cancelar no se guardarán los cambios.</w:t>
+      </w:r>
+    </w:p>
+    <w:p>
+      <w:pPr>
+        <w:jc w:val="center"/>
+      </w:pPr>
+      <w:r>
+        <w:drawing>
+          <wp:inline distT="0" distB="0" distL="0" distR="0" wp14:anchorId="4B33A751" wp14:editId="17A6A904">
+            <wp:extent cx="2781541" cy="2072820"/>
+            <wp:effectExtent l="0" t="0" r="0" b="3810"/>
+            <wp:docPr id="1066644222" name="Imagen 1"/>
+            <wp:cNvGraphicFramePr>
+              <a:graphicFrameLocks xmlns:a="http://schemas.openxmlformats.org/drawingml/2006/main" noChangeAspect="1"/>
+            </wp:cNvGraphicFramePr>
+            <a:graphic xmlns:a="http://schemas.openxmlformats.org/drawingml/2006/main">
+              <a:graphicData uri="http://schemas.openxmlformats.org/drawingml/2006/picture">
+                <pic:pic xmlns:pic="http://schemas.openxmlformats.org/drawingml/2006/picture">
+                  <pic:nvPicPr>
+                    <pic:cNvPr id="1066644222" name=""/>
+                    <pic:cNvPicPr/>
+                  </pic:nvPicPr>
+                  <pic:blipFill>
+                    <a:blip r:embed="rId17"/>
+                    <a:stretch>
+                      <a:fillRect/>
+                    </a:stretch>
+                  </pic:blipFill>
+                  <pic:spPr>
+                    <a:xfrm>
+                      <a:off x="0" y="0"/>
+                      <a:ext cx="2781541" cy="2072820"/>
+                    </a:xfrm>
+                    <a:prstGeom prst="rect">
+                      <a:avLst/>
+                    </a:prstGeom>
+                  </pic:spPr>
+                </pic:pic>
+              </a:graphicData>
+            </a:graphic>
+          </wp:inline>
+        </w:drawing>
+      </w:r>
+    </w:p>
+    <w:p>
+      <w:pPr>
+        <w:jc w:val="center"/>
+      </w:pPr>
+      <w:r>
+        <w:lastRenderedPageBreak/>
+        <w:drawing>
+          <wp:inline distT="0" distB="0" distL="0" distR="0" wp14:anchorId="49A29FFB" wp14:editId="0EF06203">
+            <wp:extent cx="4160881" cy="2796782"/>
+            <wp:effectExtent l="0" t="0" r="0" b="3810"/>
+            <wp:docPr id="677356254" name="Imagen 1"/>
+            <wp:cNvGraphicFramePr>
+              <a:graphicFrameLocks xmlns:a="http://schemas.openxmlformats.org/drawingml/2006/main" noChangeAspect="1"/>
+            </wp:cNvGraphicFramePr>
+            <a:graphic xmlns:a="http://schemas.openxmlformats.org/drawingml/2006/main">
+              <a:graphicData uri="http://schemas.openxmlformats.org/drawingml/2006/picture">
+                <pic:pic xmlns:pic="http://schemas.openxmlformats.org/drawingml/2006/picture">
+                  <pic:nvPicPr>
+                    <pic:cNvPr id="677356254" name=""/>
+                    <pic:cNvPicPr/>
+                  </pic:nvPicPr>
+                  <pic:blipFill>
+                    <a:blip r:embed="rId18"/>
+                    <a:stretch>
+                      <a:fillRect/>
+                    </a:stretch>
+                  </pic:blipFill>
+                  <pic:spPr>
+                    <a:xfrm>
+                      <a:off x="0" y="0"/>
+                      <a:ext cx="4160881" cy="2796782"/>
+                    </a:xfrm>
+                    <a:prstGeom prst="rect">
+                      <a:avLst/>
+                    </a:prstGeom>
+                  </pic:spPr>
+                </pic:pic>
+              </a:graphicData>
+            </a:graphic>
+          </wp:inline>
+        </w:drawing>
+      </w:r>
+    </w:p>
+    <w:p>
+      <w:pPr>
+        <w:jc w:val="center"/>
+      </w:pPr>
+      <w:r>
+        <w:drawing>
+          <wp:inline distT="0" distB="0" distL="0" distR="0" wp14:anchorId="406889E9" wp14:editId="057F8212">
+            <wp:extent cx="4160881" cy="2796782"/>
+            <wp:effectExtent l="0" t="0" r="0" b="3810"/>
+            <wp:docPr id="554845062" name="Imagen 1"/>
+            <wp:cNvGraphicFramePr>
+              <a:graphicFrameLocks xmlns:a="http://schemas.openxmlformats.org/drawingml/2006/main" noChangeAspect="1"/>
+            </wp:cNvGraphicFramePr>
+            <a:graphic xmlns:a="http://schemas.openxmlformats.org/drawingml/2006/main">
+              <a:graphicData uri="http://schemas.openxmlformats.org/drawingml/2006/picture">
+                <pic:pic xmlns:pic="http://schemas.openxmlformats.org/drawingml/2006/picture">
+                  <pic:nvPicPr>
+                    <pic:cNvPr id="554845062" name=""/>
+                    <pic:cNvPicPr/>
+                  </pic:nvPicPr>
+                  <pic:blipFill>
+                    <a:blip r:embed="rId19"/>
+                    <a:stretch>
+                      <a:fillRect/>
+                    </a:stretch>
+                  </pic:blipFill>
+                  <pic:spPr>
+                    <a:xfrm>
+                      <a:off x="0" y="0"/>
+                      <a:ext cx="4160881" cy="2796782"/>
+                    </a:xfrm>
+                    <a:prstGeom prst="rect">
+                      <a:avLst/>
+                    </a:prstGeom>
+                  </pic:spPr>
+                </pic:pic>
+              </a:graphicData>
+            </a:graphic>
+          </wp:inline>
+        </w:drawing>
+      </w:r>
+    </w:p>
+    <w:p>
+      <w:pPr>
+        <w:jc w:val="center"/>
+      </w:pPr>
+    </w:p>
+    <w:p>
+      <w:pPr>
+        <w:jc w:val="center"/>
+      </w:pPr>
+    </w:p>
+    <w:p>
+      <w:pPr>
+        <w:jc w:val="center"/>
+      </w:pPr>
+    </w:p>
+    <w:p>
+      <w:pPr>
+        <w:jc w:val="center"/>
+      </w:pPr>
+    </w:p>
+    <w:p>
+      <w:pPr>
+        <w:jc w:val="center"/>
+      </w:pPr>
+    </w:p>
+    <w:p>
+      <w:pPr>
+        <w:jc w:val="center"/>
+      </w:pPr>
+    </w:p>
+    <w:p>
+      <w:pPr>
+        <w:jc w:val="center"/>
+      </w:pPr>
+    </w:p>
+    <w:p>
+      <w:pPr>
+        <w:rPr>
+          <w:b/>
+          <w:bCs/>
+          <w:sz w:val="32"/>
+          <w:szCs w:val="32"/>
+        </w:rPr>
+      </w:pPr>
+      <w:r>
+        <w:rPr>
+          <w:b/>
+          <w:bCs/>
+          <w:sz w:val="32"/>
+          <w:szCs w:val="32"/>
+        </w:rPr>
+        <w:lastRenderedPageBreak/>
+        <w:t>Borrar usuario</w:t>
       </w:r>
       <w:r>
         <w:rPr>
@@ -695,52 +1756,1682 @@
       </w:r>
     </w:p>
     <w:p>
-      <w:pPr>
-        <w:rPr>
-          <w:b/>
-          <w:bCs/>
-          <w:sz w:val="32"/>
-          <w:szCs w:val="32"/>
-        </w:rPr>
-      </w:pPr>
-      <w:r>
-        <w:rPr>
-          <w:b/>
-          <w:bCs/>
-          <w:sz w:val="32"/>
-          <w:szCs w:val="32"/>
-        </w:rPr>
+      <w:r>
+        <w:t xml:space="preserve">De igual forma para eliminar un usuario debe </w:t>
+      </w:r>
+      <w:r>
+        <w:t xml:space="preserve">seleccionarlo y tocar el botón de borrar, al hacerlo aparecerá una ventana de confirmación, si </w:t>
+      </w:r>
+      <w:r>
+        <w:t xml:space="preserve">presiona “yes” </w:t>
+      </w:r>
+      <w:r>
+        <w:t>el usuario se borrará y ya no aparecerá en la tabla</w:t>
+      </w:r>
+      <w:r>
+        <w:t xml:space="preserve"> (Nota importante: si el usuario tiene un préstamo pendiente no se podrá eliminar).</w:t>
+      </w:r>
+    </w:p>
+    <w:p>
+      <w:pPr>
+        <w:jc w:val="center"/>
+      </w:pPr>
+      <w:r>
+        <w:drawing>
+          <wp:inline distT="0" distB="0" distL="0" distR="0" wp14:anchorId="1D331865" wp14:editId="4C3B8C72">
+            <wp:extent cx="2499577" cy="1150720"/>
+            <wp:effectExtent l="0" t="0" r="0" b="0"/>
+            <wp:docPr id="1817984358" name="Imagen 1"/>
+            <wp:cNvGraphicFramePr>
+              <a:graphicFrameLocks xmlns:a="http://schemas.openxmlformats.org/drawingml/2006/main" noChangeAspect="1"/>
+            </wp:cNvGraphicFramePr>
+            <a:graphic xmlns:a="http://schemas.openxmlformats.org/drawingml/2006/main">
+              <a:graphicData uri="http://schemas.openxmlformats.org/drawingml/2006/picture">
+                <pic:pic xmlns:pic="http://schemas.openxmlformats.org/drawingml/2006/picture">
+                  <pic:nvPicPr>
+                    <pic:cNvPr id="1817984358" name=""/>
+                    <pic:cNvPicPr/>
+                  </pic:nvPicPr>
+                  <pic:blipFill>
+                    <a:blip r:embed="rId20"/>
+                    <a:stretch>
+                      <a:fillRect/>
+                    </a:stretch>
+                  </pic:blipFill>
+                  <pic:spPr>
+                    <a:xfrm>
+                      <a:off x="0" y="0"/>
+                      <a:ext cx="2499577" cy="1150720"/>
+                    </a:xfrm>
+                    <a:prstGeom prst="rect">
+                      <a:avLst/>
+                    </a:prstGeom>
+                  </pic:spPr>
+                </pic:pic>
+              </a:graphicData>
+            </a:graphic>
+          </wp:inline>
+        </w:drawing>
+      </w:r>
+    </w:p>
+    <w:p>
+      <w:pPr>
+        <w:rPr>
+          <w:b/>
+          <w:bCs/>
+          <w:sz w:val="32"/>
+          <w:szCs w:val="32"/>
+        </w:rPr>
+      </w:pPr>
+      <w:r>
+        <w:rPr>
+          <w:b/>
+          <w:bCs/>
+          <w:sz w:val="32"/>
+          <w:szCs w:val="32"/>
+        </w:rPr>
+        <w:t>Categorías</w:t>
+      </w:r>
+      <w:r>
+        <w:rPr>
+          <w:b/>
+          <w:bCs/>
+          <w:sz w:val="32"/>
+          <w:szCs w:val="32"/>
+        </w:rPr>
+        <w:t>:</w:t>
+      </w:r>
+    </w:p>
+    <w:p>
+      <w:r>
+        <w:t xml:space="preserve">El funcionamiento de las categorías es similar al de los usuarios, al presionar el botón de categorías verá una tabla </w:t>
+      </w:r>
+      <w:r>
+        <w:t xml:space="preserve">que muestra el código de la categoría y su nombre. El código es establecido automáticamente por lo que al crear una categoría solo debe ingresar el </w:t>
+      </w:r>
+      <w:r>
+        <w:t>nombre, editar y borrar una categoría es igual que con los usuarios.</w:t>
+      </w:r>
+    </w:p>
+    <w:p>
+      <w:pPr>
+        <w:jc w:val="center"/>
+      </w:pPr>
+      <w:r>
+        <w:drawing>
+          <wp:inline distT="0" distB="0" distL="0" distR="0" wp14:anchorId="4D0A21D0" wp14:editId="18C0082C">
+            <wp:extent cx="4160881" cy="2796782"/>
+            <wp:effectExtent l="0" t="0" r="0" b="3810"/>
+            <wp:docPr id="457299486" name="Imagen 1"/>
+            <wp:cNvGraphicFramePr>
+              <a:graphicFrameLocks xmlns:a="http://schemas.openxmlformats.org/drawingml/2006/main" noChangeAspect="1"/>
+            </wp:cNvGraphicFramePr>
+            <a:graphic xmlns:a="http://schemas.openxmlformats.org/drawingml/2006/main">
+              <a:graphicData uri="http://schemas.openxmlformats.org/drawingml/2006/picture">
+                <pic:pic xmlns:pic="http://schemas.openxmlformats.org/drawingml/2006/picture">
+                  <pic:nvPicPr>
+                    <pic:cNvPr id="457299486" name=""/>
+                    <pic:cNvPicPr/>
+                  </pic:nvPicPr>
+                  <pic:blipFill>
+                    <a:blip r:embed="rId21"/>
+                    <a:stretch>
+                      <a:fillRect/>
+                    </a:stretch>
+                  </pic:blipFill>
+                  <pic:spPr>
+                    <a:xfrm>
+                      <a:off x="0" y="0"/>
+                      <a:ext cx="4160881" cy="2796782"/>
+                    </a:xfrm>
+                    <a:prstGeom prst="rect">
+                      <a:avLst/>
+                    </a:prstGeom>
+                  </pic:spPr>
+                </pic:pic>
+              </a:graphicData>
+            </a:graphic>
+          </wp:inline>
+        </w:drawing>
+      </w:r>
+    </w:p>
+    <w:p>
+      <w:pPr>
+        <w:jc w:val="center"/>
+      </w:pPr>
+      <w:r>
         <w:lastRenderedPageBreak/>
-        <w:t>Paso 1</w:t>
-      </w:r>
-      <w:r>
-        <w:rPr>
-          <w:b/>
-          <w:bCs/>
-          <w:sz w:val="32"/>
-          <w:szCs w:val="32"/>
-        </w:rPr>
-        <w:t>3</w:t>
-      </w:r>
-      <w:r>
-        <w:rPr>
-          <w:b/>
-          <w:bCs/>
-          <w:sz w:val="32"/>
-          <w:szCs w:val="32"/>
-        </w:rPr>
-        <w:t>:</w:t>
-      </w:r>
-    </w:p>
-    <w:p>
-      <w:pPr>
-        <w:rPr>
-          <w:b/>
-          <w:bCs/>
-          <w:sz w:val="32"/>
-          <w:szCs w:val="32"/>
-        </w:rPr>
-      </w:pPr>
+        <w:drawing>
+          <wp:inline distT="0" distB="0" distL="0" distR="0" wp14:anchorId="0313905C" wp14:editId="2095D465">
+            <wp:extent cx="4160881" cy="2796782"/>
+            <wp:effectExtent l="0" t="0" r="0" b="3810"/>
+            <wp:docPr id="45695732" name="Imagen 1"/>
+            <wp:cNvGraphicFramePr>
+              <a:graphicFrameLocks xmlns:a="http://schemas.openxmlformats.org/drawingml/2006/main" noChangeAspect="1"/>
+            </wp:cNvGraphicFramePr>
+            <a:graphic xmlns:a="http://schemas.openxmlformats.org/drawingml/2006/main">
+              <a:graphicData uri="http://schemas.openxmlformats.org/drawingml/2006/picture">
+                <pic:pic xmlns:pic="http://schemas.openxmlformats.org/drawingml/2006/picture">
+                  <pic:nvPicPr>
+                    <pic:cNvPr id="45695732" name=""/>
+                    <pic:cNvPicPr/>
+                  </pic:nvPicPr>
+                  <pic:blipFill>
+                    <a:blip r:embed="rId22"/>
+                    <a:stretch>
+                      <a:fillRect/>
+                    </a:stretch>
+                  </pic:blipFill>
+                  <pic:spPr>
+                    <a:xfrm>
+                      <a:off x="0" y="0"/>
+                      <a:ext cx="4160881" cy="2796782"/>
+                    </a:xfrm>
+                    <a:prstGeom prst="rect">
+                      <a:avLst/>
+                    </a:prstGeom>
+                  </pic:spPr>
+                </pic:pic>
+              </a:graphicData>
+            </a:graphic>
+          </wp:inline>
+        </w:drawing>
+      </w:r>
+    </w:p>
+    <w:p>
+      <w:pPr>
+        <w:rPr>
+          <w:b/>
+          <w:bCs/>
+          <w:sz w:val="32"/>
+          <w:szCs w:val="32"/>
+        </w:rPr>
+      </w:pPr>
+      <w:r>
+        <w:rPr>
+          <w:b/>
+          <w:bCs/>
+          <w:sz w:val="32"/>
+          <w:szCs w:val="32"/>
+        </w:rPr>
+        <w:t>Tipos:</w:t>
+      </w:r>
+    </w:p>
+    <w:p>
+      <w:r>
+        <w:t>Los tipos también tiene un comportamiento similar</w:t>
+      </w:r>
+      <w:r>
+        <w:t>, podrá ver el código y el nombre, al crear un tipo nuevo solo solicitará el nombre, puede editarlos y borrarlos</w:t>
+      </w:r>
+      <w:r>
+        <w:t xml:space="preserve"> como se explicó anteriormente.</w:t>
+      </w:r>
+    </w:p>
+    <w:p>
+      <w:pPr>
+        <w:jc w:val="center"/>
+      </w:pPr>
+      <w:r>
+        <w:drawing>
+          <wp:inline distT="0" distB="0" distL="0" distR="0" wp14:anchorId="6317F057" wp14:editId="286C1D43">
+            <wp:extent cx="4160881" cy="2796782"/>
+            <wp:effectExtent l="0" t="0" r="0" b="3810"/>
+            <wp:docPr id="2137503736" name="Imagen 1"/>
+            <wp:cNvGraphicFramePr>
+              <a:graphicFrameLocks xmlns:a="http://schemas.openxmlformats.org/drawingml/2006/main" noChangeAspect="1"/>
+            </wp:cNvGraphicFramePr>
+            <a:graphic xmlns:a="http://schemas.openxmlformats.org/drawingml/2006/main">
+              <a:graphicData uri="http://schemas.openxmlformats.org/drawingml/2006/picture">
+                <pic:pic xmlns:pic="http://schemas.openxmlformats.org/drawingml/2006/picture">
+                  <pic:nvPicPr>
+                    <pic:cNvPr id="2137503736" name=""/>
+                    <pic:cNvPicPr/>
+                  </pic:nvPicPr>
+                  <pic:blipFill>
+                    <a:blip r:embed="rId23"/>
+                    <a:stretch>
+                      <a:fillRect/>
+                    </a:stretch>
+                  </pic:blipFill>
+                  <pic:spPr>
+                    <a:xfrm>
+                      <a:off x="0" y="0"/>
+                      <a:ext cx="4160881" cy="2796782"/>
+                    </a:xfrm>
+                    <a:prstGeom prst="rect">
+                      <a:avLst/>
+                    </a:prstGeom>
+                  </pic:spPr>
+                </pic:pic>
+              </a:graphicData>
+            </a:graphic>
+          </wp:inline>
+        </w:drawing>
+      </w:r>
+    </w:p>
+    <w:p>
+      <w:pPr>
+        <w:jc w:val="center"/>
+      </w:pPr>
+    </w:p>
+    <w:p>
+      <w:pPr>
+        <w:jc w:val="center"/>
+      </w:pPr>
+    </w:p>
+    <w:p>
+      <w:pPr>
+        <w:jc w:val="center"/>
+      </w:pPr>
+    </w:p>
+    <w:p>
+      <w:pPr>
+        <w:jc w:val="center"/>
+      </w:pPr>
+    </w:p>
+    <w:p>
+      <w:pPr>
+        <w:rPr>
+          <w:b/>
+          <w:sz w:val="32"/>
+          <w:szCs w:val="32"/>
+        </w:rPr>
+      </w:pPr>
+      <w:r>
+        <w:rPr>
+          <w:b/>
+          <w:sz w:val="32"/>
+          <w:szCs w:val="32"/>
+        </w:rPr>
+        <w:lastRenderedPageBreak/>
+        <w:t>Ítem:</w:t>
+      </w:r>
+    </w:p>
+    <w:p>
+      <w:pPr>
+        <w:rPr>
+          <w:bCs/>
+        </w:rPr>
+      </w:pPr>
+      <w:r>
+        <w:rPr>
+          <w:bCs/>
+        </w:rPr>
+        <w:t>Crear un ítem requiere un poco más de trabajo</w:t>
+      </w:r>
+      <w:r>
+        <w:rPr>
+          <w:bCs/>
+        </w:rPr>
+        <w:t xml:space="preserve">, al entrar a la ventana de ítems podrá ver la misma tabla que con los </w:t>
+      </w:r>
+      <w:r>
+        <w:rPr>
+          <w:bCs/>
+        </w:rPr>
+        <w:t>otros apartados, sin embargo, esta cuenta con más información</w:t>
+      </w:r>
+      <w:r>
+        <w:rPr>
+          <w:bCs/>
+        </w:rPr>
+        <w:t xml:space="preserve">, lo más importante es la </w:t>
+      </w:r>
+      <w:r>
+        <w:rPr>
+          <w:bCs/>
+        </w:rPr>
+        <w:t>columna de “Prestados” que muestra “Disponible” si el ítem se puede prestar y “Prestado” si no</w:t>
+      </w:r>
+      <w:r>
+        <w:rPr>
+          <w:bCs/>
+        </w:rPr>
+        <w:t xml:space="preserve">. Los botones de editar y borrar </w:t>
+      </w:r>
+      <w:r>
+        <w:rPr>
+          <w:bCs/>
+        </w:rPr>
+        <w:t xml:space="preserve">funcionan exactamente </w:t>
+      </w:r>
+      <w:r>
+        <w:rPr>
+          <w:bCs/>
+        </w:rPr>
+        <w:t>iguales</w:t>
+      </w:r>
+      <w:r>
+        <w:rPr>
+          <w:bCs/>
+        </w:rPr>
+        <w:t xml:space="preserve">, </w:t>
+      </w:r>
+      <w:r>
+        <w:rPr>
+          <w:bCs/>
+        </w:rPr>
+        <w:t>lo</w:t>
+      </w:r>
+      <w:r>
+        <w:rPr>
+          <w:bCs/>
+        </w:rPr>
+        <w:t xml:space="preserve"> único diferente es </w:t>
+      </w:r>
+      <w:r>
+        <w:rPr>
+          <w:bCs/>
+        </w:rPr>
+        <w:t>al crear un ítem.</w:t>
+      </w:r>
+    </w:p>
+    <w:p>
+      <w:pPr>
+        <w:jc w:val="center"/>
+        <w:rPr>
+          <w:bCs/>
+        </w:rPr>
+      </w:pPr>
+      <w:r>
+        <w:rPr>
+          <w:bCs/>
+        </w:rPr>
+        <w:drawing>
+          <wp:inline distT="0" distB="0" distL="0" distR="0" wp14:anchorId="01CD6966" wp14:editId="5C9D5A08">
+            <wp:extent cx="3657600" cy="1959620"/>
+            <wp:effectExtent l="0" t="0" r="0" b="2540"/>
+            <wp:docPr id="1168186130" name="Imagen 1"/>
+            <wp:cNvGraphicFramePr>
+              <a:graphicFrameLocks xmlns:a="http://schemas.openxmlformats.org/drawingml/2006/main" noChangeAspect="1"/>
+            </wp:cNvGraphicFramePr>
+            <a:graphic xmlns:a="http://schemas.openxmlformats.org/drawingml/2006/main">
+              <a:graphicData uri="http://schemas.openxmlformats.org/drawingml/2006/picture">
+                <pic:pic xmlns:pic="http://schemas.openxmlformats.org/drawingml/2006/picture">
+                  <pic:nvPicPr>
+                    <pic:cNvPr id="1168186130" name=""/>
+                    <pic:cNvPicPr/>
+                  </pic:nvPicPr>
+                  <pic:blipFill>
+                    <a:blip r:embed="rId24"/>
+                    <a:stretch>
+                      <a:fillRect/>
+                    </a:stretch>
+                  </pic:blipFill>
+                  <pic:spPr>
+                    <a:xfrm>
+                      <a:off x="0" y="0"/>
+                      <a:ext cx="3670712" cy="1966645"/>
+                    </a:xfrm>
+                    <a:prstGeom prst="rect">
+                      <a:avLst/>
+                    </a:prstGeom>
+                  </pic:spPr>
+                </pic:pic>
+              </a:graphicData>
+            </a:graphic>
+          </wp:inline>
+        </w:drawing>
+      </w:r>
+    </w:p>
+    <w:p>
+      <w:pPr>
+        <w:rPr>
+          <w:b/>
+          <w:sz w:val="32"/>
+          <w:szCs w:val="32"/>
+        </w:rPr>
+      </w:pPr>
+      <w:r>
+        <w:rPr>
+          <w:b/>
+          <w:sz w:val="32"/>
+          <w:szCs w:val="32"/>
+        </w:rPr>
+        <w:t>Crear ítem:</w:t>
+      </w:r>
+    </w:p>
+    <w:p>
+      <w:pPr>
+        <w:rPr>
+          <w:bCs/>
+        </w:rPr>
+      </w:pPr>
+      <w:r>
+        <w:rPr>
+          <w:bCs/>
+        </w:rPr>
+        <w:t>Al igual que en l</w:t>
+      </w:r>
+      <w:r>
+        <w:rPr>
+          <w:bCs/>
+        </w:rPr>
+        <w:t>as secciones anteriores al crear un ítem el código se asigna automáticamente, los datos que solicita son el nombre del ítem, una breve descripción de lo que es, el tipo</w:t>
+      </w:r>
+      <w:r>
+        <w:rPr>
+          <w:bCs/>
+        </w:rPr>
+        <w:t xml:space="preserve"> de ítem, solamente se puede seleccionar un tipo por ítem, debe </w:t>
+      </w:r>
+      <w:r>
+        <w:rPr>
+          <w:bCs/>
+        </w:rPr>
+        <w:t xml:space="preserve">tocar la flecha hacia abajo en la lista </w:t>
+      </w:r>
+      <w:r>
+        <w:rPr>
+          <w:bCs/>
+        </w:rPr>
+        <w:t>a la par de donde dice “Tipo” para desplegar todos los tipos anteriormente creados</w:t>
+      </w:r>
+      <w:r>
+        <w:rPr>
+          <w:bCs/>
+        </w:rPr>
+        <w:t>. En la parte de la derecha podrá ver las categorías que creó</w:t>
+      </w:r>
+      <w:r>
+        <w:rPr>
+          <w:bCs/>
+        </w:rPr>
+        <w:t>, se puede seleccionar una o más, todas se le asignarán al ítem al crearlo, para agregar varias es necesario presionar la tecla “control” o “ctrl” y dar clic en las categorías que quiere añadir.</w:t>
+      </w:r>
+      <w:r>
+        <w:rPr>
+          <w:bCs/>
+        </w:rPr>
+        <w:t xml:space="preserve"> Cuando cuente con toda la información llena solo presiona el botón OK y se creará el ítem.</w:t>
+      </w:r>
+    </w:p>
+    <w:p>
+      <w:pPr>
+        <w:jc w:val="center"/>
+        <w:rPr>
+          <w:bCs/>
+        </w:rPr>
+      </w:pPr>
+      <w:r>
+        <w:rPr>
+          <w:bCs/>
+        </w:rPr>
+        <w:drawing>
+          <wp:inline distT="0" distB="0" distL="0" distR="0" wp14:anchorId="6A7FADCC" wp14:editId="2C065B26">
+            <wp:extent cx="3706417" cy="2156460"/>
+            <wp:effectExtent l="0" t="0" r="8890" b="0"/>
+            <wp:docPr id="891838014" name="Imagen 1"/>
+            <wp:cNvGraphicFramePr>
+              <a:graphicFrameLocks xmlns:a="http://schemas.openxmlformats.org/drawingml/2006/main" noChangeAspect="1"/>
+            </wp:cNvGraphicFramePr>
+            <a:graphic xmlns:a="http://schemas.openxmlformats.org/drawingml/2006/main">
+              <a:graphicData uri="http://schemas.openxmlformats.org/drawingml/2006/picture">
+                <pic:pic xmlns:pic="http://schemas.openxmlformats.org/drawingml/2006/picture">
+                  <pic:nvPicPr>
+                    <pic:cNvPr id="891838014" name=""/>
+                    <pic:cNvPicPr/>
+                  </pic:nvPicPr>
+                  <pic:blipFill>
+                    <a:blip r:embed="rId25"/>
+                    <a:stretch>
+                      <a:fillRect/>
+                    </a:stretch>
+                  </pic:blipFill>
+                  <pic:spPr>
+                    <a:xfrm>
+                      <a:off x="0" y="0"/>
+                      <a:ext cx="3733663" cy="2172312"/>
+                    </a:xfrm>
+                    <a:prstGeom prst="rect">
+                      <a:avLst/>
+                    </a:prstGeom>
+                  </pic:spPr>
+                </pic:pic>
+              </a:graphicData>
+            </a:graphic>
+          </wp:inline>
+        </w:drawing>
+      </w:r>
+    </w:p>
+    <w:p>
+      <w:pPr>
+        <w:rPr>
+          <w:b/>
+          <w:sz w:val="32"/>
+          <w:szCs w:val="32"/>
+        </w:rPr>
+      </w:pPr>
+      <w:r>
+        <w:rPr>
+          <w:b/>
+          <w:sz w:val="32"/>
+          <w:szCs w:val="32"/>
+        </w:rPr>
+        <w:lastRenderedPageBreak/>
+        <w:t>Pestaña de préstamo:</w:t>
+      </w:r>
+    </w:p>
+    <w:p>
+      <w:pPr>
+        <w:rPr>
+          <w:bCs/>
+        </w:rPr>
+      </w:pPr>
+      <w:r>
+        <w:rPr>
+          <w:bCs/>
+        </w:rPr>
+        <w:t>Para este punto ya debe tener todos los elementos necesarios para crear un préstamo, por eso ahora se explicará cómo crearlo y las diferentes funciones que tiene esta sección</w:t>
+      </w:r>
+      <w:r>
+        <w:rPr>
+          <w:bCs/>
+        </w:rPr>
+        <w:t>. Al ingresar a esta sección verá una tabla con la información de los diferentes prestamos creados</w:t>
+      </w:r>
+      <w:r>
+        <w:rPr>
+          <w:bCs/>
+        </w:rPr>
+        <w:t xml:space="preserve"> junto a dos botones, </w:t>
+      </w:r>
+      <w:r>
+        <w:rPr>
+          <w:bCs/>
+        </w:rPr>
+        <w:t xml:space="preserve">presione “Crear préstamo” para crear un nuevo préstamo o “Finalizar préstamo” para </w:t>
+      </w:r>
+      <w:r>
+        <w:rPr>
+          <w:bCs/>
+        </w:rPr>
+        <w:t>finalizar un préstamo ya existente, el botón no servirá si no hay prestamos ya que es necesario seleccionar uno primero.</w:t>
+      </w:r>
+    </w:p>
+    <w:p>
+      <w:pPr>
+        <w:jc w:val="center"/>
+        <w:rPr>
+          <w:bCs/>
+        </w:rPr>
+      </w:pPr>
+      <w:r>
+        <w:rPr>
+          <w:bCs/>
+        </w:rPr>
+        <w:drawing>
+          <wp:inline distT="0" distB="0" distL="0" distR="0" wp14:anchorId="19FA7341" wp14:editId="38244DAB">
+            <wp:extent cx="4160881" cy="2682472"/>
+            <wp:effectExtent l="0" t="0" r="0" b="3810"/>
+            <wp:docPr id="1989814023" name="Imagen 1"/>
+            <wp:cNvGraphicFramePr>
+              <a:graphicFrameLocks xmlns:a="http://schemas.openxmlformats.org/drawingml/2006/main" noChangeAspect="1"/>
+            </wp:cNvGraphicFramePr>
+            <a:graphic xmlns:a="http://schemas.openxmlformats.org/drawingml/2006/main">
+              <a:graphicData uri="http://schemas.openxmlformats.org/drawingml/2006/picture">
+                <pic:pic xmlns:pic="http://schemas.openxmlformats.org/drawingml/2006/picture">
+                  <pic:nvPicPr>
+                    <pic:cNvPr id="1989814023" name=""/>
+                    <pic:cNvPicPr/>
+                  </pic:nvPicPr>
+                  <pic:blipFill>
+                    <a:blip r:embed="rId26"/>
+                    <a:stretch>
+                      <a:fillRect/>
+                    </a:stretch>
+                  </pic:blipFill>
+                  <pic:spPr>
+                    <a:xfrm>
+                      <a:off x="0" y="0"/>
+                      <a:ext cx="4160881" cy="2682472"/>
+                    </a:xfrm>
+                    <a:prstGeom prst="rect">
+                      <a:avLst/>
+                    </a:prstGeom>
+                  </pic:spPr>
+                </pic:pic>
+              </a:graphicData>
+            </a:graphic>
+          </wp:inline>
+        </w:drawing>
+      </w:r>
+    </w:p>
+    <w:p>
+      <w:pPr>
+        <w:rPr>
+          <w:b/>
+          <w:sz w:val="32"/>
+          <w:szCs w:val="32"/>
+        </w:rPr>
+      </w:pPr>
+      <w:r>
+        <w:rPr>
+          <w:b/>
+          <w:sz w:val="32"/>
+          <w:szCs w:val="32"/>
+        </w:rPr>
+        <w:t>Crear préstamo:</w:t>
+      </w:r>
+    </w:p>
+    <w:p>
+      <w:pPr>
+        <w:rPr>
+          <w:bCs/>
+        </w:rPr>
+      </w:pPr>
+      <w:r>
+        <w:rPr>
+          <w:bCs/>
+        </w:rPr>
+        <w:t xml:space="preserve">En esta parte se le solicitarán los datos </w:t>
+      </w:r>
+      <w:r>
+        <w:rPr>
+          <w:bCs/>
+        </w:rPr>
+        <w:t xml:space="preserve">necesarios para crear un préstamo, el código se asigna automáticamente, </w:t>
+      </w:r>
+      <w:r>
+        <w:rPr>
+          <w:bCs/>
+        </w:rPr>
+        <w:t xml:space="preserve">debe elegir </w:t>
+      </w:r>
+      <w:r>
+        <w:rPr>
+          <w:bCs/>
+        </w:rPr>
+        <w:t>uno de los usuarios creados anteriormente, este es el usuario al que se le realizará el préstamo</w:t>
+      </w:r>
+      <w:r>
+        <w:rPr>
+          <w:bCs/>
+        </w:rPr>
+        <w:t>, después debe ingresar el tipo de alerta</w:t>
+      </w:r>
+      <w:r>
+        <w:rPr>
+          <w:bCs/>
+        </w:rPr>
+        <w:t>.</w:t>
+      </w:r>
+      <w:r>
+        <w:rPr>
+          <w:bCs/>
+        </w:rPr>
+        <w:t xml:space="preserve"> </w:t>
+      </w:r>
+      <w:r>
+        <w:rPr>
+          <w:bCs/>
+        </w:rPr>
+        <w:t>L</w:t>
+      </w:r>
+      <w:r>
+        <w:rPr>
+          <w:bCs/>
+        </w:rPr>
+        <w:t>a</w:t>
+      </w:r>
+      <w:r>
+        <w:rPr>
+          <w:bCs/>
+        </w:rPr>
+        <w:t xml:space="preserve"> alerta </w:t>
+      </w:r>
+      <w:r>
+        <w:rPr>
+          <w:bCs/>
+        </w:rPr>
+        <w:t xml:space="preserve">tiene tres opciones y sirve como un recordatorio de que el plazo de préstamo se </w:t>
+      </w:r>
+      <w:r>
+        <w:rPr>
+          <w:bCs/>
+        </w:rPr>
+        <w:t xml:space="preserve">terminó, la primera opción es “Sin alerta”, aquí se considerará como un préstamo sin tiempo </w:t>
+      </w:r>
+      <w:r>
+        <w:rPr>
+          <w:bCs/>
+        </w:rPr>
+        <w:t>límite</w:t>
+      </w:r>
+      <w:r>
+        <w:rPr>
+          <w:bCs/>
+        </w:rPr>
+        <w:t xml:space="preserve">, por lo que no mostrará ninguna alerta sin importar si ingresa </w:t>
+      </w:r>
+      <w:r>
+        <w:rPr>
+          <w:bCs/>
+        </w:rPr>
+        <w:t>algún número en el cuadro de abajo</w:t>
+      </w:r>
+      <w:r>
+        <w:rPr>
+          <w:bCs/>
+        </w:rPr>
+        <w:t xml:space="preserve">, será ignorado. </w:t>
+      </w:r>
+    </w:p>
+    <w:p>
+      <w:pPr>
+        <w:rPr>
+          <w:bCs/>
+        </w:rPr>
+      </w:pPr>
+      <w:r>
+        <w:rPr>
+          <w:bCs/>
+        </w:rPr>
+        <w:t xml:space="preserve">La segunda opción es “Una vez”, con esta opción </w:t>
+      </w:r>
+      <w:r>
+        <w:rPr>
+          <w:bCs/>
+        </w:rPr>
+        <w:t xml:space="preserve">cuando cierre la aplicación y la vuelva a abrir se verificará si se superó el tiempo </w:t>
+      </w:r>
+      <w:r>
+        <w:rPr>
+          <w:bCs/>
+        </w:rPr>
+        <w:t xml:space="preserve">límite, si se superó mostrará una alerta </w:t>
+      </w:r>
+      <w:r>
+        <w:rPr>
+          <w:b/>
+        </w:rPr>
+        <w:t xml:space="preserve">solamente la primera vez que abra el programa luego de </w:t>
+      </w:r>
+      <w:r>
+        <w:rPr>
+          <w:b/>
+        </w:rPr>
+        <w:t>terminar el plazo</w:t>
+      </w:r>
+      <w:r>
+        <w:rPr>
+          <w:bCs/>
+        </w:rPr>
+        <w:t>. La tercera opción es “Repetido</w:t>
+      </w:r>
+      <w:r>
+        <w:rPr>
+          <w:bCs/>
+        </w:rPr>
+        <w:t>” que mostrará la alerta siempre que habrá la aplicación luego de finalizado el plazo</w:t>
+      </w:r>
+      <w:r>
+        <w:rPr>
+          <w:bCs/>
+        </w:rPr>
+        <w:t xml:space="preserve">. En la segunda y tercera opción será obligatorio ingresa la cantidad de tiempo que debe pasar para </w:t>
+      </w:r>
+      <w:r>
+        <w:rPr>
+          <w:bCs/>
+        </w:rPr>
+        <w:t>que se active la alerta, sino el programa mostrará una pantalla de error hasta que lo ingrese.</w:t>
+      </w:r>
+    </w:p>
+    <w:p>
+      <w:pPr>
+        <w:rPr>
+          <w:bCs/>
+        </w:rPr>
+      </w:pPr>
+      <w:r>
+        <w:rPr>
+          <w:bCs/>
+        </w:rPr>
+        <w:lastRenderedPageBreak/>
+        <w:t xml:space="preserve">Por </w:t>
+      </w:r>
+      <w:r>
+        <w:rPr>
+          <w:bCs/>
+        </w:rPr>
+        <w:t>último,</w:t>
+      </w:r>
+      <w:r>
+        <w:rPr>
+          <w:bCs/>
+        </w:rPr>
+        <w:t xml:space="preserve"> debe elegir los ítems que quiere agregar al préstamo, son los ítems que se le darán al usuario</w:t>
+      </w:r>
+      <w:r>
+        <w:rPr>
+          <w:bCs/>
+        </w:rPr>
+        <w:t>, presione el botón de agregar ítem y se abrirá una ventana donde aparecerán todos los ítems que no estén prestados, seleccione uno y presione el botón de OK, con esto se agregará a la lista de ítems a prestar</w:t>
+      </w:r>
+      <w:r>
+        <w:rPr>
+          <w:bCs/>
+        </w:rPr>
+        <w:t>, debe ingresar al menos uno.</w:t>
+      </w:r>
+    </w:p>
+    <w:p>
+      <w:pPr>
+        <w:rPr>
+          <w:bCs/>
+        </w:rPr>
+      </w:pPr>
+      <w:r>
+        <w:rPr>
+          <w:bCs/>
+        </w:rPr>
+        <w:t>Con todo esto ya puede crear el préstamo,</w:t>
+      </w:r>
+      <w:r>
+        <w:rPr>
+          <w:bCs/>
+        </w:rPr>
+        <w:t xml:space="preserve"> aparecerá en la tabla principal y podrá ver el tipo de alerta que tiene, la cantidad de ítems prestados, entre otra información.</w:t>
+      </w:r>
+      <w:r>
+        <w:rPr>
+          <w:bCs/>
+        </w:rPr>
+        <w:t xml:space="preserve"> Los ítems se marcarán como prestados y no aparecerán en los siguientes prestamos, puede verificarlo en </w:t>
+      </w:r>
+      <w:r>
+        <w:rPr>
+          <w:bCs/>
+        </w:rPr>
+        <w:t>la tabla de ítems anteriormente explicada.</w:t>
+      </w:r>
+      <w:r>
+        <w:rPr>
+          <w:bCs/>
+        </w:rPr>
+        <w:t xml:space="preserve"> Si presiona el botón de finalizar préstamo los ítems se marcarán como disponibles y se podrán volver a usar, </w:t>
+      </w:r>
+      <w:r>
+        <w:rPr>
+          <w:bCs/>
+        </w:rPr>
+        <w:t xml:space="preserve">el préstamo se eliminará y </w:t>
+      </w:r>
+      <w:r>
+        <w:rPr>
+          <w:bCs/>
+        </w:rPr>
+        <w:t>de ser necesario el usuario se podrá borrar (si no tiene más prestamos pendientes)</w:t>
+      </w:r>
+    </w:p>
+    <w:p>
+      <w:pPr>
+        <w:jc w:val="center"/>
+        <w:rPr>
+          <w:bCs/>
+        </w:rPr>
+      </w:pPr>
+      <w:r>
+        <w:rPr>
+          <w:bCs/>
+        </w:rPr>
+        <w:drawing>
+          <wp:inline distT="0" distB="0" distL="0" distR="0" wp14:anchorId="1872C145" wp14:editId="056D2ED0">
+            <wp:extent cx="4404742" cy="2385267"/>
+            <wp:effectExtent l="0" t="0" r="0" b="0"/>
+            <wp:docPr id="795478035" name="Imagen 1"/>
+            <wp:cNvGraphicFramePr>
+              <a:graphicFrameLocks xmlns:a="http://schemas.openxmlformats.org/drawingml/2006/main" noChangeAspect="1"/>
+            </wp:cNvGraphicFramePr>
+            <a:graphic xmlns:a="http://schemas.openxmlformats.org/drawingml/2006/main">
+              <a:graphicData uri="http://schemas.openxmlformats.org/drawingml/2006/picture">
+                <pic:pic xmlns:pic="http://schemas.openxmlformats.org/drawingml/2006/picture">
+                  <pic:nvPicPr>
+                    <pic:cNvPr id="795478035" name=""/>
+                    <pic:cNvPicPr/>
+                  </pic:nvPicPr>
+                  <pic:blipFill>
+                    <a:blip r:embed="rId27"/>
+                    <a:stretch>
+                      <a:fillRect/>
+                    </a:stretch>
+                  </pic:blipFill>
+                  <pic:spPr>
+                    <a:xfrm>
+                      <a:off x="0" y="0"/>
+                      <a:ext cx="4404742" cy="2385267"/>
+                    </a:xfrm>
+                    <a:prstGeom prst="rect">
+                      <a:avLst/>
+                    </a:prstGeom>
+                  </pic:spPr>
+                </pic:pic>
+              </a:graphicData>
+            </a:graphic>
+          </wp:inline>
+        </w:drawing>
+      </w:r>
+    </w:p>
+    <w:p>
+      <w:pPr>
+        <w:jc w:val="center"/>
+        <w:rPr>
+          <w:bCs/>
+        </w:rPr>
+      </w:pPr>
+      <w:r>
+        <w:rPr>
+          <w:bCs/>
+        </w:rPr>
+        <w:drawing>
+          <wp:inline distT="0" distB="0" distL="0" distR="0" wp14:anchorId="20523B38" wp14:editId="0DB68DCB">
+            <wp:extent cx="4160881" cy="2682472"/>
+            <wp:effectExtent l="0" t="0" r="0" b="3810"/>
+            <wp:docPr id="680991063" name="Imagen 1"/>
+            <wp:cNvGraphicFramePr>
+              <a:graphicFrameLocks xmlns:a="http://schemas.openxmlformats.org/drawingml/2006/main" noChangeAspect="1"/>
+            </wp:cNvGraphicFramePr>
+            <a:graphic xmlns:a="http://schemas.openxmlformats.org/drawingml/2006/main">
+              <a:graphicData uri="http://schemas.openxmlformats.org/drawingml/2006/picture">
+                <pic:pic xmlns:pic="http://schemas.openxmlformats.org/drawingml/2006/picture">
+                  <pic:nvPicPr>
+                    <pic:cNvPr id="680991063" name=""/>
+                    <pic:cNvPicPr/>
+                  </pic:nvPicPr>
+                  <pic:blipFill>
+                    <a:blip r:embed="rId28"/>
+                    <a:stretch>
+                      <a:fillRect/>
+                    </a:stretch>
+                  </pic:blipFill>
+                  <pic:spPr>
+                    <a:xfrm>
+                      <a:off x="0" y="0"/>
+                      <a:ext cx="4160881" cy="2682472"/>
+                    </a:xfrm>
+                    <a:prstGeom prst="rect">
+                      <a:avLst/>
+                    </a:prstGeom>
+                  </pic:spPr>
+                </pic:pic>
+              </a:graphicData>
+            </a:graphic>
+          </wp:inline>
+        </w:drawing>
+      </w:r>
+    </w:p>
+    <w:p>
+      <w:pPr>
+        <w:jc w:val="center"/>
+        <w:rPr>
+          <w:bCs/>
+        </w:rPr>
+      </w:pPr>
+      <w:r>
+        <w:rPr>
+          <w:bCs/>
+        </w:rPr>
+        <w:lastRenderedPageBreak/>
+        <w:drawing>
+          <wp:inline distT="0" distB="0" distL="0" distR="0" wp14:anchorId="4D205227" wp14:editId="6BFC7F14">
+            <wp:extent cx="3596952" cy="1150720"/>
+            <wp:effectExtent l="0" t="0" r="3810" b="0"/>
+            <wp:docPr id="925852861" name="Imagen 1"/>
+            <wp:cNvGraphicFramePr>
+              <a:graphicFrameLocks xmlns:a="http://schemas.openxmlformats.org/drawingml/2006/main" noChangeAspect="1"/>
+            </wp:cNvGraphicFramePr>
+            <a:graphic xmlns:a="http://schemas.openxmlformats.org/drawingml/2006/main">
+              <a:graphicData uri="http://schemas.openxmlformats.org/drawingml/2006/picture">
+                <pic:pic xmlns:pic="http://schemas.openxmlformats.org/drawingml/2006/picture">
+                  <pic:nvPicPr>
+                    <pic:cNvPr id="925852861" name=""/>
+                    <pic:cNvPicPr/>
+                  </pic:nvPicPr>
+                  <pic:blipFill>
+                    <a:blip r:embed="rId29"/>
+                    <a:stretch>
+                      <a:fillRect/>
+                    </a:stretch>
+                  </pic:blipFill>
+                  <pic:spPr>
+                    <a:xfrm>
+                      <a:off x="0" y="0"/>
+                      <a:ext cx="3596952" cy="1150720"/>
+                    </a:xfrm>
+                    <a:prstGeom prst="rect">
+                      <a:avLst/>
+                    </a:prstGeom>
+                  </pic:spPr>
+                </pic:pic>
+              </a:graphicData>
+            </a:graphic>
+          </wp:inline>
+        </w:drawing>
+      </w:r>
+    </w:p>
+    <w:p>
+      <w:pPr>
+        <w:jc w:val="center"/>
+        <w:rPr>
+          <w:bCs/>
+        </w:rPr>
+      </w:pPr>
+      <w:r>
+        <w:rPr>
+          <w:bCs/>
+        </w:rPr>
+        <w:drawing>
+          <wp:inline distT="0" distB="0" distL="0" distR="0" wp14:anchorId="00EC3CAD" wp14:editId="77602266">
+            <wp:extent cx="4266785" cy="2286000"/>
+            <wp:effectExtent l="0" t="0" r="635" b="0"/>
+            <wp:docPr id="1279328913" name="Imagen 1"/>
+            <wp:cNvGraphicFramePr>
+              <a:graphicFrameLocks xmlns:a="http://schemas.openxmlformats.org/drawingml/2006/main" noChangeAspect="1"/>
+            </wp:cNvGraphicFramePr>
+            <a:graphic xmlns:a="http://schemas.openxmlformats.org/drawingml/2006/main">
+              <a:graphicData uri="http://schemas.openxmlformats.org/drawingml/2006/picture">
+                <pic:pic xmlns:pic="http://schemas.openxmlformats.org/drawingml/2006/picture">
+                  <pic:nvPicPr>
+                    <pic:cNvPr id="1279328913" name=""/>
+                    <pic:cNvPicPr/>
+                  </pic:nvPicPr>
+                  <pic:blipFill>
+                    <a:blip r:embed="rId30"/>
+                    <a:stretch>
+                      <a:fillRect/>
+                    </a:stretch>
+                  </pic:blipFill>
+                  <pic:spPr>
+                    <a:xfrm>
+                      <a:off x="0" y="0"/>
+                      <a:ext cx="4271873" cy="2288726"/>
+                    </a:xfrm>
+                    <a:prstGeom prst="rect">
+                      <a:avLst/>
+                    </a:prstGeom>
+                  </pic:spPr>
+                </pic:pic>
+              </a:graphicData>
+            </a:graphic>
+          </wp:inline>
+        </w:drawing>
+      </w:r>
+    </w:p>
+    <w:p>
+      <w:pPr>
+        <w:rPr>
+          <w:b/>
+          <w:bCs/>
+          <w:sz w:val="32"/>
+          <w:szCs w:val="32"/>
+        </w:rPr>
+      </w:pPr>
+      <w:r>
+        <w:rPr>
+          <w:b/>
+          <w:bCs/>
+          <w:sz w:val="32"/>
+          <w:szCs w:val="32"/>
+        </w:rPr>
+        <w:t>Pestaña de reportes:</w:t>
+      </w:r>
+    </w:p>
+    <w:p>
+      <w:r>
+        <w:t xml:space="preserve">Al crear tantas cosas es necesario llevar un registro </w:t>
+      </w:r>
+      <w:r>
+        <w:t>de todo, para eso es la pestaña de registros, ahí podrá ver toda la información filtrada por los diferentes elementos que componen un préstamo</w:t>
+      </w:r>
+      <w:r>
+        <w:t>.</w:t>
+      </w:r>
+    </w:p>
+    <w:p>
+      <w:pPr>
+        <w:jc w:val="center"/>
+      </w:pPr>
+      <w:r>
+        <w:drawing>
+          <wp:inline distT="0" distB="0" distL="0" distR="0" wp14:anchorId="1B49C7DC" wp14:editId="78851125">
+            <wp:extent cx="4160881" cy="2682472"/>
+            <wp:effectExtent l="0" t="0" r="0" b="3810"/>
+            <wp:docPr id="1014072217" name="Imagen 1"/>
+            <wp:cNvGraphicFramePr>
+              <a:graphicFrameLocks xmlns:a="http://schemas.openxmlformats.org/drawingml/2006/main" noChangeAspect="1"/>
+            </wp:cNvGraphicFramePr>
+            <a:graphic xmlns:a="http://schemas.openxmlformats.org/drawingml/2006/main">
+              <a:graphicData uri="http://schemas.openxmlformats.org/drawingml/2006/picture">
+                <pic:pic xmlns:pic="http://schemas.openxmlformats.org/drawingml/2006/picture">
+                  <pic:nvPicPr>
+                    <pic:cNvPr id="1014072217" name=""/>
+                    <pic:cNvPicPr/>
+                  </pic:nvPicPr>
+                  <pic:blipFill>
+                    <a:blip r:embed="rId31"/>
+                    <a:stretch>
+                      <a:fillRect/>
+                    </a:stretch>
+                  </pic:blipFill>
+                  <pic:spPr>
+                    <a:xfrm>
+                      <a:off x="0" y="0"/>
+                      <a:ext cx="4160881" cy="2682472"/>
+                    </a:xfrm>
+                    <a:prstGeom prst="rect">
+                      <a:avLst/>
+                    </a:prstGeom>
+                  </pic:spPr>
+                </pic:pic>
+              </a:graphicData>
+            </a:graphic>
+          </wp:inline>
+        </w:drawing>
+      </w:r>
+    </w:p>
+    <w:p>
+      <w:pPr>
+        <w:jc w:val="center"/>
+      </w:pPr>
+    </w:p>
+    <w:p>
+      <w:pPr>
+        <w:jc w:val="center"/>
+      </w:pPr>
+    </w:p>
+    <w:p>
+      <w:pPr>
+        <w:rPr>
+          <w:b/>
+          <w:bCs/>
+          <w:sz w:val="32"/>
+          <w:szCs w:val="32"/>
+        </w:rPr>
+      </w:pPr>
+      <w:r>
+        <w:rPr>
+          <w:b/>
+          <w:bCs/>
+          <w:sz w:val="32"/>
+          <w:szCs w:val="32"/>
+        </w:rPr>
+        <w:lastRenderedPageBreak/>
+        <w:t>Reporte por usuario:</w:t>
+      </w:r>
+    </w:p>
+    <w:p>
+      <w:r>
+        <w:t xml:space="preserve">Aquí verá </w:t>
+      </w:r>
+      <w:r>
+        <w:rPr>
+          <w:b/>
+          <w:bCs/>
+        </w:rPr>
+        <w:t>únicamente</w:t>
+      </w:r>
+      <w:r>
+        <w:t xml:space="preserve"> los usuarios que tienen un préstamo activo</w:t>
+      </w:r>
+      <w:r>
+        <w:t xml:space="preserve"> junto a su respectiva información, en la parte inferior a la izquierda podrá ver un botón de “Más información”, </w:t>
+      </w:r>
+      <w:r>
+        <w:t>si selecciona un usuario y presiona ese botón podrá ver una tabla con los ítems que se le han prestado</w:t>
+      </w:r>
+      <w:r>
+        <w:t>.</w:t>
+      </w:r>
+      <w:r>
+        <w:t xml:space="preserve"> Presione el botón de OK en ambas ventanas para cerrarlas.</w:t>
+      </w:r>
+    </w:p>
+    <w:p>
+      <w:pPr>
+        <w:jc w:val="center"/>
+      </w:pPr>
+      <w:r>
+        <w:drawing>
+          <wp:inline distT="0" distB="0" distL="0" distR="0" wp14:anchorId="713921EB" wp14:editId="37D7182D">
+            <wp:extent cx="4160881" cy="2796782"/>
+            <wp:effectExtent l="0" t="0" r="0" b="3810"/>
+            <wp:docPr id="479049429" name="Imagen 1"/>
+            <wp:cNvGraphicFramePr>
+              <a:graphicFrameLocks xmlns:a="http://schemas.openxmlformats.org/drawingml/2006/main" noChangeAspect="1"/>
+            </wp:cNvGraphicFramePr>
+            <a:graphic xmlns:a="http://schemas.openxmlformats.org/drawingml/2006/main">
+              <a:graphicData uri="http://schemas.openxmlformats.org/drawingml/2006/picture">
+                <pic:pic xmlns:pic="http://schemas.openxmlformats.org/drawingml/2006/picture">
+                  <pic:nvPicPr>
+                    <pic:cNvPr id="479049429" name=""/>
+                    <pic:cNvPicPr/>
+                  </pic:nvPicPr>
+                  <pic:blipFill>
+                    <a:blip r:embed="rId32"/>
+                    <a:stretch>
+                      <a:fillRect/>
+                    </a:stretch>
+                  </pic:blipFill>
+                  <pic:spPr>
+                    <a:xfrm>
+                      <a:off x="0" y="0"/>
+                      <a:ext cx="4160881" cy="2796782"/>
+                    </a:xfrm>
+                    <a:prstGeom prst="rect">
+                      <a:avLst/>
+                    </a:prstGeom>
+                  </pic:spPr>
+                </pic:pic>
+              </a:graphicData>
+            </a:graphic>
+          </wp:inline>
+        </w:drawing>
+      </w:r>
+    </w:p>
+    <w:p>
+      <w:pPr>
+        <w:jc w:val="center"/>
+      </w:pPr>
+      <w:r>
+        <w:drawing>
+          <wp:inline distT="0" distB="0" distL="0" distR="0" wp14:anchorId="48A4B117" wp14:editId="712A9B37">
+            <wp:extent cx="4160881" cy="2796782"/>
+            <wp:effectExtent l="0" t="0" r="0" b="3810"/>
+            <wp:docPr id="816130967" name="Imagen 1"/>
+            <wp:cNvGraphicFramePr>
+              <a:graphicFrameLocks xmlns:a="http://schemas.openxmlformats.org/drawingml/2006/main" noChangeAspect="1"/>
+            </wp:cNvGraphicFramePr>
+            <a:graphic xmlns:a="http://schemas.openxmlformats.org/drawingml/2006/main">
+              <a:graphicData uri="http://schemas.openxmlformats.org/drawingml/2006/picture">
+                <pic:pic xmlns:pic="http://schemas.openxmlformats.org/drawingml/2006/picture">
+                  <pic:nvPicPr>
+                    <pic:cNvPr id="816130967" name=""/>
+                    <pic:cNvPicPr/>
+                  </pic:nvPicPr>
+                  <pic:blipFill>
+                    <a:blip r:embed="rId33"/>
+                    <a:stretch>
+                      <a:fillRect/>
+                    </a:stretch>
+                  </pic:blipFill>
+                  <pic:spPr>
+                    <a:xfrm>
+                      <a:off x="0" y="0"/>
+                      <a:ext cx="4160881" cy="2796782"/>
+                    </a:xfrm>
+                    <a:prstGeom prst="rect">
+                      <a:avLst/>
+                    </a:prstGeom>
+                  </pic:spPr>
+                </pic:pic>
+              </a:graphicData>
+            </a:graphic>
+          </wp:inline>
+        </w:drawing>
+      </w:r>
+    </w:p>
+    <w:p>
+      <w:pPr>
+        <w:jc w:val="center"/>
+      </w:pPr>
+    </w:p>
+    <w:p>
+      <w:pPr>
+        <w:jc w:val="center"/>
+      </w:pPr>
+    </w:p>
+    <w:p>
+      <w:pPr>
+        <w:jc w:val="center"/>
+      </w:pPr>
+    </w:p>
+    <w:p>
+      <w:pPr>
+        <w:rPr>
+          <w:b/>
+          <w:bCs/>
+          <w:sz w:val="32"/>
+          <w:szCs w:val="32"/>
+        </w:rPr>
+      </w:pPr>
+      <w:r>
+        <w:rPr>
+          <w:b/>
+          <w:bCs/>
+          <w:sz w:val="32"/>
+          <w:szCs w:val="32"/>
+        </w:rPr>
+        <w:lastRenderedPageBreak/>
+        <w:t>Reporte por ítem:</w:t>
+      </w:r>
+    </w:p>
+    <w:p>
+      <w:r>
+        <w:t>Si presiona el botón de reporte por ítem verá una tabla con todos los ítems existentes ordenados alfabéticamente</w:t>
+      </w:r>
+      <w:r>
+        <w:t xml:space="preserve"> junto con su respectiva información. Lo más importante de esta pantalla es que al final de la tabla se muestra el usuario </w:t>
+      </w:r>
+      <w:r>
+        <w:t>que tiene ese ítem en un préstamo, si el ítem no está prestado se mostrará</w:t>
+      </w:r>
+      <w:r>
+        <w:t xml:space="preserve"> “-“ en su lugar.</w:t>
+      </w:r>
+    </w:p>
+    <w:p>
+      <w:pPr>
+        <w:jc w:val="center"/>
+      </w:pPr>
+      <w:r>
+        <w:drawing>
+          <wp:inline distT="0" distB="0" distL="0" distR="0" wp14:anchorId="2843DA51" wp14:editId="4E1B187C">
+            <wp:extent cx="4160881" cy="2796782"/>
+            <wp:effectExtent l="0" t="0" r="0" b="3810"/>
+            <wp:docPr id="1041856784" name="Imagen 1"/>
+            <wp:cNvGraphicFramePr>
+              <a:graphicFrameLocks xmlns:a="http://schemas.openxmlformats.org/drawingml/2006/main" noChangeAspect="1"/>
+            </wp:cNvGraphicFramePr>
+            <a:graphic xmlns:a="http://schemas.openxmlformats.org/drawingml/2006/main">
+              <a:graphicData uri="http://schemas.openxmlformats.org/drawingml/2006/picture">
+                <pic:pic xmlns:pic="http://schemas.openxmlformats.org/drawingml/2006/picture">
+                  <pic:nvPicPr>
+                    <pic:cNvPr id="1041856784" name=""/>
+                    <pic:cNvPicPr/>
+                  </pic:nvPicPr>
+                  <pic:blipFill>
+                    <a:blip r:embed="rId34"/>
+                    <a:stretch>
+                      <a:fillRect/>
+                    </a:stretch>
+                  </pic:blipFill>
+                  <pic:spPr>
+                    <a:xfrm>
+                      <a:off x="0" y="0"/>
+                      <a:ext cx="4160881" cy="2796782"/>
+                    </a:xfrm>
+                    <a:prstGeom prst="rect">
+                      <a:avLst/>
+                    </a:prstGeom>
+                  </pic:spPr>
+                </pic:pic>
+              </a:graphicData>
+            </a:graphic>
+          </wp:inline>
+        </w:drawing>
+      </w:r>
+    </w:p>
+    <w:p>
+      <w:pPr>
+        <w:rPr>
+          <w:b/>
+          <w:sz w:val="32"/>
+          <w:szCs w:val="32"/>
+        </w:rPr>
+      </w:pPr>
+      <w:r>
+        <w:rPr>
+          <w:b/>
+          <w:sz w:val="32"/>
+          <w:szCs w:val="32"/>
+        </w:rPr>
+        <w:t>Reporte por categoría:</w:t>
+      </w:r>
+    </w:p>
+    <w:p>
+      <w:pPr>
+        <w:rPr>
+          <w:bCs/>
+        </w:rPr>
+      </w:pPr>
+      <w:r>
+        <w:rPr>
+          <w:bCs/>
+        </w:rPr>
+        <w:t xml:space="preserve">De igual forma aquí encontrará todas las categorías creadas ordenadas alfabéticamente, en la </w:t>
+      </w:r>
+      <w:r>
+        <w:rPr>
+          <w:bCs/>
+        </w:rPr>
+        <w:t>última</w:t>
+      </w:r>
+      <w:r>
+        <w:rPr>
+          <w:bCs/>
+        </w:rPr>
+        <w:t xml:space="preserve"> columna se muestra</w:t>
+      </w:r>
+      <w:r>
+        <w:rPr>
+          <w:bCs/>
+        </w:rPr>
+        <w:t xml:space="preserve">n los ítems que tienen esa categoría asignada, si no </w:t>
+      </w:r>
+      <w:r>
+        <w:rPr>
+          <w:bCs/>
+        </w:rPr>
+        <w:t>existe un</w:t>
+      </w:r>
+      <w:r>
+        <w:rPr>
+          <w:bCs/>
+        </w:rPr>
+        <w:t xml:space="preserve"> ítem con </w:t>
+      </w:r>
+      <w:r>
+        <w:rPr>
+          <w:bCs/>
+        </w:rPr>
+        <w:t>esa categoría se muestra “-“ en su lugar.</w:t>
+      </w:r>
+    </w:p>
+    <w:p>
+      <w:pPr>
+        <w:jc w:val="center"/>
+        <w:rPr>
+          <w:bCs/>
+        </w:rPr>
+      </w:pPr>
+      <w:r>
+        <w:rPr>
+          <w:bCs/>
+        </w:rPr>
+        <w:drawing>
+          <wp:inline distT="0" distB="0" distL="0" distR="0" wp14:anchorId="27CDBBEC" wp14:editId="1AAF2288">
+            <wp:extent cx="4160881" cy="2796782"/>
+            <wp:effectExtent l="0" t="0" r="0" b="3810"/>
+            <wp:docPr id="829479910" name="Imagen 1"/>
+            <wp:cNvGraphicFramePr>
+              <a:graphicFrameLocks xmlns:a="http://schemas.openxmlformats.org/drawingml/2006/main" noChangeAspect="1"/>
+            </wp:cNvGraphicFramePr>
+            <a:graphic xmlns:a="http://schemas.openxmlformats.org/drawingml/2006/main">
+              <a:graphicData uri="http://schemas.openxmlformats.org/drawingml/2006/picture">
+                <pic:pic xmlns:pic="http://schemas.openxmlformats.org/drawingml/2006/picture">
+                  <pic:nvPicPr>
+                    <pic:cNvPr id="829479910" name=""/>
+                    <pic:cNvPicPr/>
+                  </pic:nvPicPr>
+                  <pic:blipFill>
+                    <a:blip r:embed="rId35"/>
+                    <a:stretch>
+                      <a:fillRect/>
+                    </a:stretch>
+                  </pic:blipFill>
+                  <pic:spPr>
+                    <a:xfrm>
+                      <a:off x="0" y="0"/>
+                      <a:ext cx="4160881" cy="2796782"/>
+                    </a:xfrm>
+                    <a:prstGeom prst="rect">
+                      <a:avLst/>
+                    </a:prstGeom>
+                  </pic:spPr>
+                </pic:pic>
+              </a:graphicData>
+            </a:graphic>
+          </wp:inline>
+        </w:drawing>
+      </w:r>
+    </w:p>
+    <w:p>
+      <w:pPr>
+        <w:rPr>
+          <w:b/>
+          <w:sz w:val="32"/>
+          <w:szCs w:val="32"/>
+        </w:rPr>
+      </w:pPr>
+      <w:r>
+        <w:rPr>
+          <w:b/>
+          <w:sz w:val="32"/>
+          <w:szCs w:val="32"/>
+        </w:rPr>
+        <w:lastRenderedPageBreak/>
+        <w:t xml:space="preserve">Reporte </w:t>
+      </w:r>
+      <w:r>
+        <w:rPr>
+          <w:b/>
+          <w:sz w:val="32"/>
+          <w:szCs w:val="32"/>
+        </w:rPr>
+        <w:t>por tipo:</w:t>
+      </w:r>
+    </w:p>
+    <w:p>
+      <w:pPr>
+        <w:rPr>
+          <w:bCs/>
+        </w:rPr>
+      </w:pPr>
+      <w:r>
+        <w:rPr>
+          <w:bCs/>
+        </w:rPr>
+        <w:t xml:space="preserve">Es muy similar al reporte por categoría, se muestran </w:t>
+      </w:r>
+      <w:r>
+        <w:rPr>
+          <w:bCs/>
+        </w:rPr>
+        <w:t xml:space="preserve">todos los tipos ordenados alfabéticamente y </w:t>
+      </w:r>
+      <w:r>
+        <w:rPr>
+          <w:bCs/>
+        </w:rPr>
+        <w:t xml:space="preserve">los ítems que </w:t>
+      </w:r>
+      <w:r>
+        <w:rPr>
+          <w:bCs/>
+        </w:rPr>
+        <w:t xml:space="preserve">están </w:t>
+      </w:r>
+      <w:r>
+        <w:rPr>
+          <w:bCs/>
+        </w:rPr>
+        <w:t>asignad</w:t>
+      </w:r>
+      <w:r>
+        <w:rPr>
+          <w:bCs/>
+        </w:rPr>
+        <w:t xml:space="preserve">os </w:t>
+      </w:r>
+      <w:r>
+        <w:rPr>
+          <w:bCs/>
+        </w:rPr>
+        <w:t>ese tipo</w:t>
+      </w:r>
+    </w:p>
+    <w:p>
+      <w:pPr>
+        <w:jc w:val="center"/>
+        <w:rPr>
+          <w:bCs/>
+        </w:rPr>
+      </w:pPr>
+      <w:r>
+        <w:rPr>
+          <w:bCs/>
+        </w:rPr>
+        <w:drawing>
+          <wp:inline distT="0" distB="0" distL="0" distR="0" wp14:anchorId="3D782D8A" wp14:editId="4677DC1A">
+            <wp:extent cx="4160881" cy="2796782"/>
+            <wp:effectExtent l="0" t="0" r="0" b="3810"/>
+            <wp:docPr id="631299081" name="Imagen 1"/>
+            <wp:cNvGraphicFramePr>
+              <a:graphicFrameLocks xmlns:a="http://schemas.openxmlformats.org/drawingml/2006/main" noChangeAspect="1"/>
+            </wp:cNvGraphicFramePr>
+            <a:graphic xmlns:a="http://schemas.openxmlformats.org/drawingml/2006/main">
+              <a:graphicData uri="http://schemas.openxmlformats.org/drawingml/2006/picture">
+                <pic:pic xmlns:pic="http://schemas.openxmlformats.org/drawingml/2006/picture">
+                  <pic:nvPicPr>
+                    <pic:cNvPr id="631299081" name=""/>
+                    <pic:cNvPicPr/>
+                  </pic:nvPicPr>
+                  <pic:blipFill>
+                    <a:blip r:embed="rId36"/>
+                    <a:stretch>
+                      <a:fillRect/>
+                    </a:stretch>
+                  </pic:blipFill>
+                  <pic:spPr>
+                    <a:xfrm>
+                      <a:off x="0" y="0"/>
+                      <a:ext cx="4160881" cy="2796782"/>
+                    </a:xfrm>
+                    <a:prstGeom prst="rect">
+                      <a:avLst/>
+                    </a:prstGeom>
+                  </pic:spPr>
+                </pic:pic>
+              </a:graphicData>
+            </a:graphic>
+          </wp:inline>
+        </w:drawing>
+      </w:r>
+    </w:p>
+    <w:p>
+      <w:pPr>
+        <w:jc w:val="center"/>
+        <w:rPr>
+          <w:bCs/>
+        </w:rPr>
+      </w:pPr>
+    </w:p>
+    <w:p>
+      <w:pPr>
+        <w:rPr>
+          <w:bCs/>
+        </w:rPr>
+      </w:pPr>
+      <w:r>
+        <w:rPr>
+          <w:bCs/>
+        </w:rPr>
+        <w:t>Y con esto ya se han abarcado todas las funcionalidades del programa, ahora usted debe ser capaz de utilizar</w:t>
+      </w:r>
+      <w:r>
+        <w:rPr>
+          <w:bCs/>
+        </w:rPr>
+        <w:t>lo sin problemas, en caso de consulta puede volver a leer la sección que le esté causando problema para recordar cómo usar</w:t>
+      </w:r>
+      <w:r>
+        <w:rPr>
+          <w:bCs/>
+        </w:rPr>
+        <w:t>lo</w:t>
+      </w:r>
     </w:p>
     <w:sectPr>
       <w:pgSz w:w="12240" w:h="15840"/>

</xml_diff>